<commit_message>
Troca a instituição para FAETEC de Quintino
Co-Authored-By: Claude Opus 5.5 (1M context) <noreply@anthropic.com>
Claude-Session: https://claude.ai/code/session_01FEMtm3REE4Du1LXrG82jym
</commit_message>
<xml_diff>
--- a/docs/entrega/Trabalho_ACSO_Arthur_Pravato.docx
+++ b/docs/entrega/Trabalho_ACSO_Arthur_Pravato.docx
@@ -14,7 +14,7 @@
           <w:sz w:val="26"/>
           <w:szCs w:val="26"/>
         </w:rPr>
-        <w:t xml:space="preserve">CENTRO UNIVERSITÁRIO SÃO JOSÉ / FAETEC</w:t>
+        <w:t xml:space="preserve">FAETEC DE QUINTINO</w:t>
       </w:r>
     </w:p>
     <w:p>
@@ -426,11 +426,6 @@
       </w:r>
       <w:r>
         <w:t xml:space="preserve">	12</w:t>
-      </w:r>
-    </w:p>
-    <w:p>
-      <w:r>
-        <w:br w:type="page"/>
       </w:r>
     </w:p>
     <w:p>
@@ -442,6 +437,9 @@
           <w:docGrid w:linePitch="360"/>
         </w:sectPr>
       </w:pPr>
+      <w:r>
+        <w:br w:type="page"/>
+      </w:r>
     </w:p>
     <w:p>
       <w:pPr>
@@ -1714,7 +1712,7 @@
           <wp:inline distT="0" distB="0" distL="0" distR="0">
             <wp:extent cx="5715000" cy="2143125"/>
             <wp:effectExtent t="0" r="0" b="0" l="0"/>
-            <wp:docPr id="1" name="" descr="" title=""/>
+            <wp:docPr id="1" name=""/>
             <wp:cNvGraphicFramePr>
               <a:graphicFrameLocks xmlns:a="http://schemas.openxmlformats.org/drawingml/2006/main" noChangeAspect="1"/>
             </wp:cNvGraphicFramePr>
@@ -1776,7 +1774,7 @@
           <wp:inline distT="0" distB="0" distL="0" distR="0">
             <wp:extent cx="5715000" cy="2419350"/>
             <wp:effectExtent t="0" r="0" b="0" l="0"/>
-            <wp:docPr id="1" name="" descr="" title=""/>
+            <wp:docPr id="2" name=""/>
             <wp:cNvGraphicFramePr>
               <a:graphicFrameLocks xmlns:a="http://schemas.openxmlformats.org/drawingml/2006/main" noChangeAspect="1"/>
             </wp:cNvGraphicFramePr>
@@ -3887,7 +3885,7 @@
           <wp:inline distT="0" distB="0" distL="0" distR="0">
             <wp:extent cx="5715000" cy="3048000"/>
             <wp:effectExtent t="0" r="0" b="0" l="0"/>
-            <wp:docPr id="1" name="" descr="" title=""/>
+            <wp:docPr id="3" name=""/>
             <wp:cNvGraphicFramePr>
               <a:graphicFrameLocks xmlns:a="http://schemas.openxmlformats.org/drawingml/2006/main" noChangeAspect="1"/>
             </wp:cNvGraphicFramePr>
@@ -5714,7 +5712,7 @@
           <wp:inline distT="0" distB="0" distL="0" distR="0">
             <wp:extent cx="4095750" cy="4057650"/>
             <wp:effectExtent t="0" r="0" b="0" l="0"/>
-            <wp:docPr id="1" name="" descr="" title=""/>
+            <wp:docPr id="4" name=""/>
             <wp:cNvGraphicFramePr>
               <a:graphicFrameLocks xmlns:a="http://schemas.openxmlformats.org/drawingml/2006/main" noChangeAspect="1"/>
             </wp:cNvGraphicFramePr>
@@ -5760,7 +5758,7 @@
           <wp:inline distT="0" distB="0" distL="0" distR="0">
             <wp:extent cx="4095750" cy="4972050"/>
             <wp:effectExtent t="0" r="0" b="0" l="0"/>
-            <wp:docPr id="1" name="" descr="" title=""/>
+            <wp:docPr id="5" name=""/>
             <wp:cNvGraphicFramePr>
               <a:graphicFrameLocks xmlns:a="http://schemas.openxmlformats.org/drawingml/2006/main" noChangeAspect="1"/>
             </wp:cNvGraphicFramePr>
@@ -6411,7 +6409,7 @@
       </w:r>
     </w:p>
     <w:sectPr>
-      <w:footerReference w:type="default" r:id="rId7"/>
+      <w:footerReference w:type="default" r:id="rId6"/>
       <w:pgSz w:w="11906" w:h="16838" w:orient="portrait"/>
       <w:pgMar w:top="1440" w:right="1440" w:bottom="1440" w:left="1440" w:header="708" w:footer="708" w:gutter="0"/>
       <w:pgNumType/>
@@ -6419,10 +6417,6 @@
     </w:sectPr>
   </w:body>
 </w:document>
-</file>
-
-<file path=word/comments.xml><?xml version="1.0" encoding="utf-8"?>
-<w:comments xmlns:cx="http://schemas.microsoft.com/office/drawing/2014/chartex" xmlns:cx1="http://schemas.microsoft.com/office/drawing/2015/9/8/chartex" xmlns:cx2="http://schemas.microsoft.com/office/drawing/2015/10/21/chartex" xmlns:cx3="http://schemas.microsoft.com/office/drawing/2016/5/9/chartex" xmlns:cx4="http://schemas.microsoft.com/office/drawing/2016/5/10/chartex" xmlns:cx5="http://schemas.microsoft.com/office/drawing/2016/5/11/chartex" xmlns:cx6="http://schemas.microsoft.com/office/drawing/2016/5/12/chartex" xmlns:cx7="http://schemas.microsoft.com/office/drawing/2016/5/13/chartex" xmlns:cx8="http://schemas.microsoft.com/office/drawing/2016/5/14/chartex" xmlns:mc="http://schemas.openxmlformats.org/markup-compatibility/2006" xmlns:aink="http://schemas.microsoft.com/office/drawing/2016/ink" xmlns:am3d="http://schemas.microsoft.com/office/drawing/2017/model3d" xmlns:o="urn:schemas-microsoft-com:office:office" xmlns:r="http://schemas.openxmlformats.org/officeDocument/2006/relationships" xmlns:m="http://schemas.openxmlformats.org/officeDocument/2006/math" xmlns:v="urn:schemas-microsoft-com:vml" xmlns:wp14="http://schemas.microsoft.com/office/word/2010/wordprocessingDrawing" xmlns:wp="http://schemas.openxmlformats.org/drawingml/2006/wordprocessingDrawing" xmlns:w10="urn:schemas-microsoft-com:office:word" xmlns:w="http://schemas.openxmlformats.org/wordprocessingml/2006/main" xmlns:w14="http://schemas.microsoft.com/office/word/2010/wordml" xmlns:w15="http://schemas.microsoft.com/office/word/2012/wordml" xmlns:w16cex="http://schemas.microsoft.com/office/word/2018/wordml/cex" xmlns:w16cid="http://schemas.microsoft.com/office/word/2016/wordml/cid" xmlns:w16="http://schemas.microsoft.com/office/word/2018/wordml" xmlns:w16sdtdh="http://schemas.microsoft.com/office/word/2020/wordml/sdtdatahash" xmlns:w16se="http://schemas.microsoft.com/office/word/2015/wordml/symex" xmlns:wpg="http://schemas.microsoft.com/office/word/2010/wordprocessingGroup" xmlns:wpi="http://schemas.microsoft.com/office/word/2010/wordprocessingInk" xmlns:wne="http://schemas.microsoft.com/office/word/2006/wordml" xmlns:wps="http://schemas.microsoft.com/office/word/2010/wordprocessingShape"/>
 </file>
 
 <file path=word/endnotes.xml><?xml version="1.0" encoding="utf-8"?>
@@ -6474,8 +6468,26 @@
         <w:szCs w:val="20"/>
       </w:rPr>
       <w:fldChar w:fldCharType="begin"/>
+    </w:r>
+    <w:r>
+      <w:rPr>
+        <w:sz w:val="20"/>
+        <w:szCs w:val="20"/>
+      </w:rPr>
       <w:instrText xml:space="preserve">PAGE</w:instrText>
+    </w:r>
+    <w:r>
+      <w:rPr>
+        <w:sz w:val="20"/>
+        <w:szCs w:val="20"/>
+      </w:rPr>
       <w:fldChar w:fldCharType="separate"/>
+    </w:r>
+    <w:r>
+      <w:rPr>
+        <w:sz w:val="20"/>
+        <w:szCs w:val="20"/>
+      </w:rPr>
       <w:fldChar w:fldCharType="end"/>
     </w:r>
   </w:p>
@@ -6523,7 +6535,7 @@
 <w:numbering xmlns:wpc="http://schemas.microsoft.com/office/word/2010/wordprocessingCanvas" xmlns:mc="http://schemas.openxmlformats.org/markup-compatibility/2006" xmlns:o="urn:schemas-microsoft-com:office:office" xmlns:r="http://schemas.openxmlformats.org/officeDocument/2006/relationships" xmlns:m="http://schemas.openxmlformats.org/officeDocument/2006/math" xmlns:v="urn:schemas-microsoft-com:vml" xmlns:wp14="http://schemas.microsoft.com/office/word/2010/wordprocessingDrawing" xmlns:wp="http://schemas.openxmlformats.org/drawingml/2006/wordprocessingDrawing" xmlns:w10="urn:schemas-microsoft-com:office:word" xmlns:w="http://schemas.openxmlformats.org/wordprocessingml/2006/main" xmlns:w14="http://schemas.microsoft.com/office/word/2010/wordml" xmlns:w15="http://schemas.microsoft.com/office/word/2012/wordml" xmlns:wpg="http://schemas.microsoft.com/office/word/2010/wordprocessingGroup" xmlns:wpi="http://schemas.microsoft.com/office/word/2010/wordprocessingInk" xmlns:wne="http://schemas.microsoft.com/office/word/2006/wordml" xmlns:wps="http://schemas.microsoft.com/office/word/2010/wordprocessingShape" mc:Ignorable="w14 w15 wp14">
   <w:abstractNum w:abstractNumId="1" w15:restartNumberingAfterBreak="0">
     <w:multiLevelType w:val="hybridMultilevel"/>
-    <w:lvl w:ilvl="0" w15:tentative="1">
+    <w:lvl w:ilvl="0" w:tentative="1">
       <w:start w:val="1"/>
       <w:numFmt w:val="bullet"/>
       <w:lvlText w:val="●"/>
@@ -6532,7 +6544,7 @@
         <w:ind w:left="720" w:hanging="360"/>
       </w:pPr>
     </w:lvl>
-    <w:lvl w:ilvl="1" w15:tentative="1">
+    <w:lvl w:ilvl="1" w:tentative="1">
       <w:start w:val="1"/>
       <w:numFmt w:val="bullet"/>
       <w:lvlText w:val="○"/>
@@ -6541,7 +6553,7 @@
         <w:ind w:left="1440" w:hanging="360"/>
       </w:pPr>
     </w:lvl>
-    <w:lvl w:ilvl="2" w15:tentative="1">
+    <w:lvl w:ilvl="2" w:tentative="1">
       <w:start w:val="1"/>
       <w:numFmt w:val="bullet"/>
       <w:lvlText w:val="■"/>
@@ -6550,7 +6562,7 @@
         <w:ind w:left="2160" w:hanging="360"/>
       </w:pPr>
     </w:lvl>
-    <w:lvl w:ilvl="3" w15:tentative="1">
+    <w:lvl w:ilvl="3" w:tentative="1">
       <w:start w:val="1"/>
       <w:numFmt w:val="bullet"/>
       <w:lvlText w:val="●"/>
@@ -6559,7 +6571,7 @@
         <w:ind w:left="2880" w:hanging="360"/>
       </w:pPr>
     </w:lvl>
-    <w:lvl w:ilvl="4" w15:tentative="1">
+    <w:lvl w:ilvl="4" w:tentative="1">
       <w:start w:val="1"/>
       <w:numFmt w:val="bullet"/>
       <w:lvlText w:val="○"/>
@@ -6568,7 +6580,7 @@
         <w:ind w:left="3600" w:hanging="360"/>
       </w:pPr>
     </w:lvl>
-    <w:lvl w:ilvl="5" w15:tentative="1">
+    <w:lvl w:ilvl="5" w:tentative="1">
       <w:start w:val="1"/>
       <w:numFmt w:val="bullet"/>
       <w:lvlText w:val="■"/>
@@ -6577,7 +6589,7 @@
         <w:ind w:left="4320" w:hanging="360"/>
       </w:pPr>
     </w:lvl>
-    <w:lvl w:ilvl="6" w15:tentative="1">
+    <w:lvl w:ilvl="6" w:tentative="1">
       <w:start w:val="1"/>
       <w:numFmt w:val="bullet"/>
       <w:lvlText w:val="●"/>
@@ -6586,7 +6598,7 @@
         <w:ind w:left="5040" w:hanging="360"/>
       </w:pPr>
     </w:lvl>
-    <w:lvl w:ilvl="7" w15:tentative="1">
+    <w:lvl w:ilvl="7" w:tentative="1">
       <w:start w:val="1"/>
       <w:numFmt w:val="bullet"/>
       <w:lvlText w:val="●"/>
@@ -6595,7 +6607,7 @@
         <w:ind w:left="5760" w:hanging="360"/>
       </w:pPr>
     </w:lvl>
-    <w:lvl w:ilvl="8" w15:tentative="1">
+    <w:lvl w:ilvl="8" w:tentative="1">
       <w:start w:val="1"/>
       <w:numFmt w:val="bullet"/>
       <w:lvlText w:val="●"/>
@@ -6607,7 +6619,7 @@
   </w:abstractNum>
   <w:abstractNum w:abstractNumId="2" w15:restartNumberingAfterBreak="0">
     <w:multiLevelType w:val="hybridMultilevel"/>
-    <w:lvl w:ilvl="0" w15:tentative="1">
+    <w:lvl w:ilvl="0" w:tentative="1">
       <w:start w:val="1"/>
       <w:numFmt w:val="bullet"/>
       <w:lvlText w:val="•"/>
@@ -6619,7 +6631,7 @@
   </w:abstractNum>
   <w:abstractNum w:abstractNumId="3" w15:restartNumberingAfterBreak="0">
     <w:multiLevelType w:val="hybridMultilevel"/>
-    <w:lvl w:ilvl="0" w15:tentative="1">
+    <w:lvl w:ilvl="0" w:tentative="1">
       <w:start w:val="1"/>
       <w:numFmt w:val="decimal"/>
       <w:lvlText w:val="%1."/>
@@ -6631,7 +6643,7 @@
   </w:abstractNum>
   <w:abstractNum w:abstractNumId="4" w15:restartNumberingAfterBreak="0">
     <w:multiLevelType w:val="hybridMultilevel"/>
-    <w:lvl w:ilvl="0" w15:tentative="1">
+    <w:lvl w:ilvl="0" w:tentative="1">
       <w:start w:val="1"/>
       <w:numFmt w:val="decimal"/>
       <w:lvlText w:val="%1."/>
@@ -6643,7 +6655,7 @@
   </w:abstractNum>
   <w:abstractNum w:abstractNumId="5" w15:restartNumberingAfterBreak="0">
     <w:multiLevelType w:val="hybridMultilevel"/>
-    <w:lvl w:ilvl="0" w15:tentative="1">
+    <w:lvl w:ilvl="0" w:tentative="1">
       <w:start w:val="1"/>
       <w:numFmt w:val="decimal"/>
       <w:lvlText w:val="%1."/>
@@ -6698,6 +6710,25 @@
     </w:rPrDefault>
     <w:pPrDefault/>
   </w:docDefaults>
+  <w:style w:type="paragraph" w:styleId="Normal" w:default="1">
+    <w:name w:val="Normal"/>
+    <w:qFormat/>
+  </w:style>
+  <w:style w:type="table" w:styleId="TableNormal" w:default="true">
+    <w:name w:val="Normal Table"/>
+    <w:uiPriority w:val="99"/>
+    <w:semiHidden/>
+    <w:unhideWhenUsed/>
+    <w:tblPr>
+      <w:tblInd w:type="dxa" w:w="0"/>
+      <w:tblCellMar>
+        <w:top w:type="dxa" w:w="0"/>
+        <w:left w:type="dxa" w:w="108"/>
+        <w:bottom w:type="dxa" w:w="0"/>
+        <w:right w:type="dxa" w:w="108"/>
+      </w:tblCellMar>
+    </w:tblPr>
+  </w:style>
   <w:style w:type="paragraph" w:styleId="Title">
     <w:name w:val="Title"/>
     <w:basedOn w:val="Normal"/>
@@ -6706,28 +6737,6 @@
     <w:rPr>
       <w:sz w:val="56"/>
       <w:szCs w:val="56"/>
-    </w:rPr>
-  </w:style>
-  <w:style w:type="paragraph" w:styleId="Heading1">
-    <w:name w:val="Heading 1"/>
-    <w:basedOn w:val="Normal"/>
-    <w:next w:val="Normal"/>
-    <w:qFormat/>
-    <w:rPr>
-      <w:color w:val="2E74B5"/>
-      <w:sz w:val="32"/>
-      <w:szCs w:val="32"/>
-    </w:rPr>
-  </w:style>
-  <w:style w:type="paragraph" w:styleId="Heading2">
-    <w:name w:val="Heading 2"/>
-    <w:basedOn w:val="Normal"/>
-    <w:next w:val="Normal"/>
-    <w:qFormat/>
-    <w:rPr>
-      <w:color w:val="2E74B5"/>
-      <w:sz w:val="26"/>
-      <w:szCs w:val="26"/>
     </w:rPr>
   </w:style>
   <w:style w:type="paragraph" w:styleId="Heading3">
@@ -6904,4 +6913,294 @@
     </w:rPr>
   </w:style>
 </w:styles>
+</file>
+
+<file path=word/theme/theme1.xml><?xml version="1.0" encoding="utf-8"?>
+<a:theme xmlns:a="http://schemas.openxmlformats.org/drawingml/2006/main" name="Office Theme">
+  <a:themeElements>
+    <a:clrScheme name="Office">
+      <a:dk1>
+        <a:sysClr val="windowText" lastClr="000000"/>
+      </a:dk1>
+      <a:lt1>
+        <a:sysClr val="window" lastClr="FFFFFF"/>
+      </a:lt1>
+      <a:dk2>
+        <a:srgbClr val="44546A"/>
+      </a:dk2>
+      <a:lt2>
+        <a:srgbClr val="E7E6E6"/>
+      </a:lt2>
+      <a:accent1>
+        <a:srgbClr val="4472C4"/>
+      </a:accent1>
+      <a:accent2>
+        <a:srgbClr val="ED7D31"/>
+      </a:accent2>
+      <a:accent3>
+        <a:srgbClr val="A5A5A5"/>
+      </a:accent3>
+      <a:accent4>
+        <a:srgbClr val="FFC000"/>
+      </a:accent4>
+      <a:accent5>
+        <a:srgbClr val="5B9BD5"/>
+      </a:accent5>
+      <a:accent6>
+        <a:srgbClr val="70AD47"/>
+      </a:accent6>
+      <a:hlink>
+        <a:srgbClr val="0563C1"/>
+      </a:hlink>
+      <a:folHlink>
+        <a:srgbClr val="954F72"/>
+      </a:folHlink>
+    </a:clrScheme>
+    <a:fontScheme name="Office">
+      <a:majorFont>
+        <a:latin typeface="Calibri Light" panose="020F0302020204030204"/>
+        <a:ea typeface=""/>
+        <a:cs typeface=""/>
+        <a:font script="Jpan" typeface="游ゴシック Light"/>
+        <a:font script="Hang" typeface="맑은 고딕"/>
+        <a:font script="Hans" typeface="等线 Light"/>
+        <a:font script="Hant" typeface="新細明體"/>
+        <a:font script="Arab" typeface="Times New Roman"/>
+        <a:font script="Hebr" typeface="Times New Roman"/>
+        <a:font script="Thai" typeface="Angsana New"/>
+        <a:font script="Ethi" typeface="Nyala"/>
+        <a:font script="Beng" typeface="Vrinda"/>
+        <a:font script="Gujr" typeface="Shruti"/>
+        <a:font script="Khmr" typeface="MoolBoran"/>
+        <a:font script="Knda" typeface="Tunga"/>
+        <a:font script="Guru" typeface="Raavi"/>
+        <a:font script="Cans" typeface="Euphemia"/>
+        <a:font script="Cher" typeface="Plantagenet Cherokee"/>
+        <a:font script="Yiii" typeface="Microsoft Yi Baiti"/>
+        <a:font script="Tibt" typeface="Microsoft Himalaya"/>
+        <a:font script="Thaa" typeface="MV Boli"/>
+        <a:font script="Deva" typeface="Mangal"/>
+        <a:font script="Telu" typeface="Gautami"/>
+        <a:font script="Taml" typeface="Latha"/>
+        <a:font script="Syrc" typeface="Estrangelo Edessa"/>
+        <a:font script="Orya" typeface="Kalinga"/>
+        <a:font script="Mlym" typeface="Kartika"/>
+        <a:font script="Laoo" typeface="DokChampa"/>
+        <a:font script="Sinh" typeface="Iskoola Pota"/>
+        <a:font script="Mong" typeface="Mongolian Baiti"/>
+        <a:font script="Viet" typeface="Times New Roman"/>
+        <a:font script="Uigh" typeface="Microsoft Uighur"/>
+        <a:font script="Geor" typeface="Sylfaen"/>
+        <a:font script="Armn" typeface="Arial"/>
+        <a:font script="Bugi" typeface="Leelawadee UI"/>
+        <a:font script="Bopo" typeface="Microsoft JhengHei"/>
+        <a:font script="Java" typeface="Javanese Text"/>
+        <a:font script="Lisu" typeface="Segoe UI"/>
+        <a:font script="Mymr" typeface="Myanmar Text"/>
+        <a:font script="Nkoo" typeface="Ebrima"/>
+        <a:font script="Olck" typeface="Nirmala UI"/>
+        <a:font script="Osma" typeface="Ebrima"/>
+        <a:font script="Phag" typeface="Phagspa"/>
+        <a:font script="Syrn" typeface="Estrangelo Edessa"/>
+        <a:font script="Syrj" typeface="Estrangelo Edessa"/>
+        <a:font script="Syre" typeface="Estrangelo Edessa"/>
+        <a:font script="Sora" typeface="Nirmala UI"/>
+        <a:font script="Tale" typeface="Microsoft Tai Le"/>
+        <a:font script="Talu" typeface="Microsoft New Tai Lue"/>
+        <a:font script="Tfng" typeface="Ebrima"/>
+      </a:majorFont>
+      <a:minorFont>
+        <a:latin typeface="Calibri" panose="020F0502020204030204"/>
+        <a:ea typeface=""/>
+        <a:cs typeface=""/>
+        <a:font script="Jpan" typeface="游明朝"/>
+        <a:font script="Hang" typeface="맑은 고딕"/>
+        <a:font script="Hans" typeface="等线"/>
+        <a:font script="Hant" typeface="新細明體"/>
+        <a:font script="Arab" typeface="Arial"/>
+        <a:font script="Hebr" typeface="Arial"/>
+        <a:font script="Thai" typeface="Cordia New"/>
+        <a:font script="Ethi" typeface="Nyala"/>
+        <a:font script="Beng" typeface="Vrinda"/>
+        <a:font script="Gujr" typeface="Shruti"/>
+        <a:font script="Khmr" typeface="DaunPenh"/>
+        <a:font script="Knda" typeface="Tunga"/>
+        <a:font script="Guru" typeface="Raavi"/>
+        <a:font script="Cans" typeface="Euphemia"/>
+        <a:font script="Cher" typeface="Plantagenet Cherokee"/>
+        <a:font script="Yiii" typeface="Microsoft Yi Baiti"/>
+        <a:font script="Tibt" typeface="Microsoft Himalaya"/>
+        <a:font script="Thaa" typeface="MV Boli"/>
+        <a:font script="Deva" typeface="Mangal"/>
+        <a:font script="Telu" typeface="Gautami"/>
+        <a:font script="Taml" typeface="Latha"/>
+        <a:font script="Syrc" typeface="Estrangelo Edessa"/>
+        <a:font script="Orya" typeface="Kalinga"/>
+        <a:font script="Mlym" typeface="Kartika"/>
+        <a:font script="Laoo" typeface="DokChampa"/>
+        <a:font script="Sinh" typeface="Iskoola Pota"/>
+        <a:font script="Mong" typeface="Mongolian Baiti"/>
+        <a:font script="Viet" typeface="Arial"/>
+        <a:font script="Uigh" typeface="Microsoft Uighur"/>
+        <a:font script="Geor" typeface="Sylfaen"/>
+        <a:font script="Armn" typeface="Arial"/>
+        <a:font script="Bugi" typeface="Leelawadee UI"/>
+        <a:font script="Bopo" typeface="Microsoft JhengHei"/>
+        <a:font script="Java" typeface="Javanese Text"/>
+        <a:font script="Lisu" typeface="Segoe UI"/>
+        <a:font script="Mymr" typeface="Myanmar Text"/>
+        <a:font script="Nkoo" typeface="Ebrima"/>
+        <a:font script="Olck" typeface="Nirmala UI"/>
+        <a:font script="Osma" typeface="Ebrima"/>
+        <a:font script="Phag" typeface="Phagspa"/>
+        <a:font script="Syrn" typeface="Estrangelo Edessa"/>
+        <a:font script="Syrj" typeface="Estrangelo Edessa"/>
+        <a:font script="Syre" typeface="Estrangelo Edessa"/>
+        <a:font script="Sora" typeface="Nirmala UI"/>
+        <a:font script="Tale" typeface="Microsoft Tai Le"/>
+        <a:font script="Talu" typeface="Microsoft New Tai Lue"/>
+        <a:font script="Tfng" typeface="Ebrima"/>
+      </a:minorFont>
+    </a:fontScheme>
+    <a:fmtScheme name="Office">
+      <a:fillStyleLst>
+        <a:solidFill>
+          <a:schemeClr val="phClr"/>
+        </a:solidFill>
+        <a:gradFill rotWithShape="true">
+          <a:gsLst>
+            <a:gs pos="0">
+              <a:schemeClr val="phClr">
+                <a:lumMod val="110000"/>
+                <a:satMod val="105000"/>
+                <a:tint val="67000"/>
+              </a:schemeClr>
+            </a:gs>
+            <a:gs pos="50000">
+              <a:schemeClr val="phClr">
+                <a:lumMod val="105000"/>
+                <a:satMod val="103000"/>
+                <a:tint val="73000"/>
+              </a:schemeClr>
+            </a:gs>
+            <a:gs pos="100000">
+              <a:schemeClr val="phClr">
+                <a:lumMod val="105000"/>
+                <a:satMod val="109000"/>
+                <a:tint val="81000"/>
+              </a:schemeClr>
+            </a:gs>
+          </a:gsLst>
+          <a:lin ang="5400000" scaled="false"/>
+        </a:gradFill>
+        <a:gradFill rotWithShape="true">
+          <a:gsLst>
+            <a:gs pos="0">
+              <a:schemeClr val="phClr">
+                <a:satMod val="103000"/>
+                <a:lumMod val="102000"/>
+                <a:tint val="94000"/>
+              </a:schemeClr>
+            </a:gs>
+            <a:gs pos="50000">
+              <a:schemeClr val="phClr">
+                <a:satMod val="110000"/>
+                <a:lumMod val="100000"/>
+                <a:shade val="100000"/>
+              </a:schemeClr>
+            </a:gs>
+            <a:gs pos="100000">
+              <a:schemeClr val="phClr">
+                <a:lumMod val="99000"/>
+                <a:satMod val="120000"/>
+                <a:shade val="78000"/>
+              </a:schemeClr>
+            </a:gs>
+          </a:gsLst>
+          <a:lin ang="5400000" scaled="false"/>
+        </a:gradFill>
+      </a:fillStyleLst>
+      <a:lnStyleLst>
+        <a:ln w="6350" cap="flat" cmpd="sng" algn="ctr">
+          <a:solidFill>
+            <a:schemeClr val="phClr"/>
+          </a:solidFill>
+          <a:prstDash val="solid"/>
+          <a:miter lim="800000"/>
+        </a:ln>
+        <a:ln w="12700" cap="flat" cmpd="sng" algn="ctr">
+          <a:solidFill>
+            <a:schemeClr val="phClr"/>
+          </a:solidFill>
+          <a:prstDash val="solid"/>
+          <a:miter lim="800000"/>
+        </a:ln>
+        <a:ln w="19050" cap="flat" cmpd="sng" algn="ctr">
+          <a:solidFill>
+            <a:schemeClr val="phClr"/>
+          </a:solidFill>
+          <a:prstDash val="solid"/>
+          <a:miter lim="800000"/>
+        </a:ln>
+      </a:lnStyleLst>
+      <a:effectStyleLst>
+        <a:effectStyle>
+          <a:effectLst/>
+        </a:effectStyle>
+        <a:effectStyle>
+          <a:effectLst/>
+        </a:effectStyle>
+        <a:effectStyle>
+          <a:effectLst>
+            <a:outerShdw blurRad="57150" dist="19050" dir="5400000" algn="ctr" rotWithShape="false">
+              <a:srgbClr val="000000">
+                <a:alpha val="63000"/>
+              </a:srgbClr>
+            </a:outerShdw>
+          </a:effectLst>
+        </a:effectStyle>
+      </a:effectStyleLst>
+      <a:bgFillStyleLst>
+        <a:solidFill>
+          <a:schemeClr val="phClr"/>
+        </a:solidFill>
+        <a:solidFill>
+          <a:schemeClr val="phClr">
+            <a:tint val="95000"/>
+            <a:satMod val="170000"/>
+          </a:schemeClr>
+        </a:solidFill>
+        <a:gradFill rotWithShape="true">
+          <a:gsLst>
+            <a:gs pos="0">
+              <a:schemeClr val="phClr">
+                <a:tint val="93000"/>
+                <a:satMod val="150000"/>
+                <a:shade val="98000"/>
+                <a:lumMod val="102000"/>
+              </a:schemeClr>
+            </a:gs>
+            <a:gs pos="50000">
+              <a:schemeClr val="phClr">
+                <a:tint val="98000"/>
+                <a:satMod val="130000"/>
+                <a:shade val="90000"/>
+                <a:lumMod val="103000"/>
+              </a:schemeClr>
+            </a:gs>
+            <a:gs pos="100000">
+              <a:schemeClr val="phClr">
+                <a:shade val="63000"/>
+                <a:satMod val="120000"/>
+              </a:schemeClr>
+            </a:gs>
+          </a:gsLst>
+          <a:lin ang="5400000" scaled="false"/>
+        </a:gradFill>
+      </a:bgFillStyleLst>
+    </a:fmtScheme>
+  </a:themeElements>
+  <a:objectDefaults/>
+  <a:extraClrSchemeLst/>
+</a:theme>
 </file>
</xml_diff>

<commit_message>
Ajusta curso e nome da disciplina
Co-Authored-By: Claude Opus 5.5 (1M context) <noreply@anthropic.com>
Claude-Session: https://claude.ai/code/session_01FEMtm3REE4Du1LXrG82jym
</commit_message>
<xml_diff>
--- a/docs/entrega/Trabalho_ACSO_Arthur_Pravato.docx
+++ b/docs/entrega/Trabalho_ACSO_Arthur_Pravato.docx
@@ -27,7 +27,7 @@
           <w:sz w:val="24"/>
           <w:szCs w:val="24"/>
         </w:rPr>
-        <w:t xml:space="preserve">Tecnólogo em Sistemas de Informação</w:t>
+        <w:t xml:space="preserve">Técnico em Informática</w:t>
       </w:r>
     </w:p>
     <w:p>
@@ -40,7 +40,7 @@
           <w:sz w:val="24"/>
           <w:szCs w:val="24"/>
         </w:rPr>
-        <w:t xml:space="preserve">Disciplina: ACSO – Sistemas Autônomos</w:t>
+        <w:t xml:space="preserve">Disciplina: ACSO – Arquitetura e Computação de Sistemas Operacionais</w:t>
       </w:r>
     </w:p>
     <w:p>

</xml_diff>

<commit_message>
Adiciona a integração com o WhatsApp ao relatório, ao Word e à apresentação
Co-Authored-By: Claude Opus 5.5 (1M context) <noreply@anthropic.com>
Claude-Session: https://claude.ai/code/session_01FEMtm3REE4Du1LXrG82jym
</commit_message>
<xml_diff>
--- a/docs/entrega/Trabalho_ACSO_Arthur_Pravato.docx
+++ b/docs/entrega/Trabalho_ACSO_Arthur_Pravato.docx
@@ -254,7 +254,7 @@
         <w:t xml:space="preserve">6. Etapas do projeto</w:t>
       </w:r>
       <w:r>
-        <w:t xml:space="preserve">	6</w:t>
+        <w:t xml:space="preserve">	5</w:t>
       </w:r>
     </w:p>
     <w:p>
@@ -273,7 +273,7 @@
         <w:t xml:space="preserve">6.1 Definição do problema</w:t>
       </w:r>
       <w:r>
-        <w:t xml:space="preserve">	6</w:t>
+        <w:t xml:space="preserve">	5</w:t>
       </w:r>
     </w:p>
     <w:p>
@@ -358,14 +358,14 @@
           <w:tab w:val="right" w:pos="9026" w:leader="dot"/>
         </w:tabs>
         <w:spacing w:after="100"/>
-        <w:ind w:left="0"/>
-      </w:pPr>
-      <w:r>
-        <w:rPr>
-          <w:b/>
-          <w:bCs/>
-        </w:rPr>
-        <w:t xml:space="preserve">7. Camada de avaliação</w:t>
+        <w:ind w:left="400"/>
+      </w:pPr>
+      <w:r>
+        <w:rPr>
+          <w:b w:val="false"/>
+          <w:bCs w:val="false"/>
+        </w:rPr>
+        <w:t xml:space="preserve">6.6 Integração com o WhatsApp</w:t>
       </w:r>
       <w:r>
         <w:t xml:space="preserve">	8</w:t>
@@ -384,10 +384,10 @@
           <w:b/>
           <w:bCs/>
         </w:rPr>
-        <w:t xml:space="preserve">8. Conclusão</w:t>
-      </w:r>
-      <w:r>
-        <w:t xml:space="preserve">	10</w:t>
+        <w:t xml:space="preserve">7. Camada de avaliação</w:t>
+      </w:r>
+      <w:r>
+        <w:t xml:space="preserve">	9</w:t>
       </w:r>
     </w:p>
     <w:p>
@@ -403,7 +403,7 @@
           <w:b/>
           <w:bCs/>
         </w:rPr>
-        <w:t xml:space="preserve">Referências</w:t>
+        <w:t xml:space="preserve">8. Conclusão</w:t>
       </w:r>
       <w:r>
         <w:t xml:space="preserve">	11</w:t>
@@ -422,10 +422,29 @@
           <w:b/>
           <w:bCs/>
         </w:rPr>
+        <w:t xml:space="preserve">Referências</w:t>
+      </w:r>
+      <w:r>
+        <w:t xml:space="preserve">	12</w:t>
+      </w:r>
+    </w:p>
+    <w:p>
+      <w:pPr>
+        <w:tabs>
+          <w:tab w:val="right" w:pos="9026" w:leader="dot"/>
+        </w:tabs>
+        <w:spacing w:after="100"/>
+        <w:ind w:left="0"/>
+      </w:pPr>
+      <w:r>
+        <w:rPr>
+          <w:b/>
+          <w:bCs/>
+        </w:rPr>
         <w:t xml:space="preserve">Anexo A – Prompt base</w:t>
       </w:r>
       <w:r>
-        <w:t xml:space="preserve">	12</w:t>
+        <w:t xml:space="preserve">	13</w:t>
       </w:r>
     </w:p>
     <w:p>
@@ -1137,7 +1156,7 @@
                 <w:sz w:val="20"/>
                 <w:szCs w:val="20"/>
               </w:rPr>
-              <w:t xml:space="preserve">Chat do n8n (simulando WhatsApp)</w:t>
+              <w:t xml:space="preserve">WhatsApp pela Evolution API (e chat do n8n nos testes)</w:t>
             </w:r>
           </w:p>
         </w:tc>
@@ -1164,7 +1183,7 @@
                 <w:sz w:val="20"/>
                 <w:szCs w:val="20"/>
               </w:rPr>
-              <w:t xml:space="preserve">Teste imediato; WhatsApp real pela Evolution API como evolução</w:t>
+              <w:t xml:space="preserve">A Evolution API é gratuita e open-source e liga um número real ao n8n. O chat do n8n foi usado nos testes por ser imediato</w:t>
             </w:r>
           </w:p>
         </w:tc>
@@ -1856,7 +1875,7 @@
         <w:t xml:space="preserve">Interface:</w:t>
       </w:r>
       <w:r>
-        <w:t xml:space="preserve"> o cliente envia a mensagem pelo chat. O n8n recebe pelo gatilho "Chat".</w:t>
+        <w:t xml:space="preserve"> o cliente envia a mensagem pelo WhatsApp (ou pelo chat do n8n, usado nos testes). O n8n recebe pelo gatilho do fluxo.</w:t>
       </w:r>
     </w:p>
     <w:p>
@@ -4012,10 +4031,10 @@
     </w:p>
     <w:p>
       <w:pPr>
-        <w:pStyle w:val="Heading1"/>
-      </w:pPr>
-      <w:r>
-        <w:t xml:space="preserve">7. Camada de avaliação</w:t>
+        <w:pStyle w:val="Heading2"/>
+      </w:pPr>
+      <w:r>
+        <w:t xml:space="preserve">6.6 Integração com o WhatsApp</w:t>
       </w:r>
     </w:p>
     <w:p>
@@ -4024,1682 +4043,17 @@
         <w:jc w:val="both"/>
       </w:pPr>
       <w:r>
+        <w:t xml:space="preserve">Depois dos testes no chat, o agente foi ligado a um número de WhatsApp real com a </w:t>
+      </w:r>
+      <w:r>
         <w:rPr>
           <w:b/>
           <w:bCs/>
         </w:rPr>
-        <w:t xml:space="preserve">Taxa de acerto:</w:t>
-      </w:r>
-      <w:r>
-        <w:t xml:space="preserve"> cada caso foi testado em uma conversa nova e marcado como certo ou errado. O tempo foi medido no histórico de execuções do n8n.</w:t>
-      </w:r>
-    </w:p>
-    <w:tbl>
-      <w:tblPr>
-        <w:tblW w:type="dxa" w:w="9026"/>
-        <w:tblBorders>
-          <w:top w:val="single" w:color="auto" w:sz="4"/>
-          <w:left w:val="single" w:color="auto" w:sz="4"/>
-          <w:bottom w:val="single" w:color="auto" w:sz="4"/>
-          <w:right w:val="single" w:color="auto" w:sz="4"/>
-          <w:insideH w:val="single" w:color="auto" w:sz="4"/>
-          <w:insideV w:val="single" w:color="auto" w:sz="4"/>
-        </w:tblBorders>
-      </w:tblPr>
-      <w:tblGrid>
-        <w:gridCol w:w="450"/>
-        <w:gridCol w:w="2300"/>
-        <w:gridCol w:w="2050"/>
-        <w:gridCol w:w="3376"/>
-        <w:gridCol w:w="850"/>
-      </w:tblGrid>
-      <w:tr>
-        <w:trPr>
-          <w:tblHeader/>
-        </w:trPr>
-        <w:tc>
-          <w:tcPr>
-            <w:tcW w:type="dxa" w:w="450"/>
-            <w:tcBorders>
-              <w:top w:val="single" w:color="BFBFBF" w:sz="4"/>
-              <w:left w:val="single" w:color="BFBFBF" w:sz="4"/>
-              <w:bottom w:val="single" w:color="BFBFBF" w:sz="4"/>
-              <w:right w:val="single" w:color="BFBFBF" w:sz="4"/>
-            </w:tcBorders>
-            <w:shd w:fill="4A1D5C" w:color="auto" w:val="clear"/>
-            <w:tcMar>
-              <w:top w:type="dxa" w:w="80"/>
-              <w:left w:type="dxa" w:w="100"/>
-              <w:bottom w:type="dxa" w:w="80"/>
-              <w:right w:type="dxa" w:w="100"/>
-            </w:tcMar>
-          </w:tcPr>
-          <w:p>
-            <w:r>
-              <w:rPr>
-                <w:b/>
-                <w:bCs/>
-                <w:color w:val="FFFFFF"/>
-                <w:sz w:val="20"/>
-                <w:szCs w:val="20"/>
-              </w:rPr>
-              <w:t xml:space="preserve">#</w:t>
-            </w:r>
-          </w:p>
-        </w:tc>
-        <w:tc>
-          <w:tcPr>
-            <w:tcW w:type="dxa" w:w="2300"/>
-            <w:tcBorders>
-              <w:top w:val="single" w:color="BFBFBF" w:sz="4"/>
-              <w:left w:val="single" w:color="BFBFBF" w:sz="4"/>
-              <w:bottom w:val="single" w:color="BFBFBF" w:sz="4"/>
-              <w:right w:val="single" w:color="BFBFBF" w:sz="4"/>
-            </w:tcBorders>
-            <w:shd w:fill="4A1D5C" w:color="auto" w:val="clear"/>
-            <w:tcMar>
-              <w:top w:type="dxa" w:w="80"/>
-              <w:left w:type="dxa" w:w="100"/>
-              <w:bottom w:type="dxa" w:w="80"/>
-              <w:right w:type="dxa" w:w="100"/>
-            </w:tcMar>
-          </w:tcPr>
-          <w:p>
-            <w:r>
-              <w:rPr>
-                <w:b/>
-                <w:bCs/>
-                <w:color w:val="FFFFFF"/>
-                <w:sz w:val="20"/>
-                <w:szCs w:val="20"/>
-              </w:rPr>
-              <w:t xml:space="preserve">Mensagem do cliente</w:t>
-            </w:r>
-          </w:p>
-        </w:tc>
-        <w:tc>
-          <w:tcPr>
-            <w:tcW w:type="dxa" w:w="2050"/>
-            <w:tcBorders>
-              <w:top w:val="single" w:color="BFBFBF" w:sz="4"/>
-              <w:left w:val="single" w:color="BFBFBF" w:sz="4"/>
-              <w:bottom w:val="single" w:color="BFBFBF" w:sz="4"/>
-              <w:right w:val="single" w:color="BFBFBF" w:sz="4"/>
-            </w:tcBorders>
-            <w:shd w:fill="4A1D5C" w:color="auto" w:val="clear"/>
-            <w:tcMar>
-              <w:top w:type="dxa" w:w="80"/>
-              <w:left w:type="dxa" w:w="100"/>
-              <w:bottom w:type="dxa" w:w="80"/>
-              <w:right w:type="dxa" w:w="100"/>
-            </w:tcMar>
-          </w:tcPr>
-          <w:p>
-            <w:r>
-              <w:rPr>
-                <w:b/>
-                <w:bCs/>
-                <w:color w:val="FFFFFF"/>
-                <w:sz w:val="20"/>
-                <w:szCs w:val="20"/>
-              </w:rPr>
-              <w:t xml:space="preserve">Esperado</w:t>
-            </w:r>
-          </w:p>
-        </w:tc>
-        <w:tc>
-          <w:tcPr>
-            <w:tcW w:type="dxa" w:w="3376"/>
-            <w:tcBorders>
-              <w:top w:val="single" w:color="BFBFBF" w:sz="4"/>
-              <w:left w:val="single" w:color="BFBFBF" w:sz="4"/>
-              <w:bottom w:val="single" w:color="BFBFBF" w:sz="4"/>
-              <w:right w:val="single" w:color="BFBFBF" w:sz="4"/>
-            </w:tcBorders>
-            <w:shd w:fill="4A1D5C" w:color="auto" w:val="clear"/>
-            <w:tcMar>
-              <w:top w:type="dxa" w:w="80"/>
-              <w:left w:type="dxa" w:w="100"/>
-              <w:bottom w:type="dxa" w:w="80"/>
-              <w:right w:type="dxa" w:w="100"/>
-            </w:tcMar>
-          </w:tcPr>
-          <w:p>
-            <w:r>
-              <w:rPr>
-                <w:b/>
-                <w:bCs/>
-                <w:color w:val="FFFFFF"/>
-                <w:sz w:val="20"/>
-                <w:szCs w:val="20"/>
-              </w:rPr>
-              <w:t xml:space="preserve">Resultado</w:t>
-            </w:r>
-          </w:p>
-        </w:tc>
-        <w:tc>
-          <w:tcPr>
-            <w:tcW w:type="dxa" w:w="850"/>
-            <w:tcBorders>
-              <w:top w:val="single" w:color="BFBFBF" w:sz="4"/>
-              <w:left w:val="single" w:color="BFBFBF" w:sz="4"/>
-              <w:bottom w:val="single" w:color="BFBFBF" w:sz="4"/>
-              <w:right w:val="single" w:color="BFBFBF" w:sz="4"/>
-            </w:tcBorders>
-            <w:shd w:fill="4A1D5C" w:color="auto" w:val="clear"/>
-            <w:tcMar>
-              <w:top w:type="dxa" w:w="80"/>
-              <w:left w:type="dxa" w:w="100"/>
-              <w:bottom w:type="dxa" w:w="80"/>
-              <w:right w:type="dxa" w:w="100"/>
-            </w:tcMar>
-          </w:tcPr>
-          <w:p>
-            <w:r>
-              <w:rPr>
-                <w:b/>
-                <w:bCs/>
-                <w:color w:val="FFFFFF"/>
-                <w:sz w:val="20"/>
-                <w:szCs w:val="20"/>
-              </w:rPr>
-              <w:t xml:space="preserve">Tempo (s)</w:t>
-            </w:r>
-          </w:p>
-        </w:tc>
-      </w:tr>
-      <w:tr>
-        <w:tc>
-          <w:tcPr>
-            <w:tcW w:type="dxa" w:w="450"/>
-            <w:tcBorders>
-              <w:top w:val="single" w:color="BFBFBF" w:sz="4"/>
-              <w:left w:val="single" w:color="BFBFBF" w:sz="4"/>
-              <w:bottom w:val="single" w:color="BFBFBF" w:sz="4"/>
-              <w:right w:val="single" w:color="BFBFBF" w:sz="4"/>
-            </w:tcBorders>
-            <w:shd w:fill="FFFFFF" w:color="auto" w:val="clear"/>
-            <w:tcMar>
-              <w:top w:type="dxa" w:w="60"/>
-              <w:left w:type="dxa" w:w="100"/>
-              <w:bottom w:type="dxa" w:w="60"/>
-              <w:right w:type="dxa" w:w="100"/>
-            </w:tcMar>
-          </w:tcPr>
-          <w:p>
-            <w:r>
-              <w:rPr>
-                <w:sz w:val="20"/>
-                <w:szCs w:val="20"/>
-              </w:rPr>
-              <w:t xml:space="preserve">1</w:t>
-            </w:r>
-          </w:p>
-        </w:tc>
-        <w:tc>
-          <w:tcPr>
-            <w:tcW w:type="dxa" w:w="2300"/>
-            <w:tcBorders>
-              <w:top w:val="single" w:color="BFBFBF" w:sz="4"/>
-              <w:left w:val="single" w:color="BFBFBF" w:sz="4"/>
-              <w:bottom w:val="single" w:color="BFBFBF" w:sz="4"/>
-              <w:right w:val="single" w:color="BFBFBF" w:sz="4"/>
-            </w:tcBorders>
-            <w:shd w:fill="FFFFFF" w:color="auto" w:val="clear"/>
-            <w:tcMar>
-              <w:top w:type="dxa" w:w="60"/>
-              <w:left w:type="dxa" w:w="100"/>
-              <w:bottom w:type="dxa" w:w="60"/>
-              <w:right w:type="dxa" w:w="100"/>
-            </w:tcMar>
-          </w:tcPr>
-          <w:p>
-            <w:r>
-              <w:rPr>
-                <w:sz w:val="20"/>
-                <w:szCs w:val="20"/>
-              </w:rPr>
-              <w:t xml:space="preserve">"Quero cobrir meus fios brancos"</w:t>
-            </w:r>
-          </w:p>
-        </w:tc>
-        <w:tc>
-          <w:tcPr>
-            <w:tcW w:type="dxa" w:w="2050"/>
-            <w:tcBorders>
-              <w:top w:val="single" w:color="BFBFBF" w:sz="4"/>
-              <w:left w:val="single" w:color="BFBFBF" w:sz="4"/>
-              <w:bottom w:val="single" w:color="BFBFBF" w:sz="4"/>
-              <w:right w:val="single" w:color="BFBFBF" w:sz="4"/>
-            </w:tcBorders>
-            <w:shd w:fill="FFFFFF" w:color="auto" w:val="clear"/>
-            <w:tcMar>
-              <w:top w:type="dxa" w:w="60"/>
-              <w:left w:type="dxa" w:w="100"/>
-              <w:bottom w:type="dxa" w:w="60"/>
-              <w:right w:type="dxa" w:w="100"/>
-            </w:tcMar>
-          </w:tcPr>
-          <w:p>
-            <w:r>
-              <w:rPr>
-                <w:sz w:val="20"/>
-                <w:szCs w:val="20"/>
-              </w:rPr>
-              <w:t xml:space="preserve">Coloração, Juliana, 2h, R$ 180</w:t>
-            </w:r>
-          </w:p>
-        </w:tc>
-        <w:tc>
-          <w:tcPr>
-            <w:tcW w:type="dxa" w:w="3376"/>
-            <w:tcBorders>
-              <w:top w:val="single" w:color="BFBFBF" w:sz="4"/>
-              <w:left w:val="single" w:color="BFBFBF" w:sz="4"/>
-              <w:bottom w:val="single" w:color="BFBFBF" w:sz="4"/>
-              <w:right w:val="single" w:color="BFBFBF" w:sz="4"/>
-            </w:tcBorders>
-            <w:shd w:fill="FFFFFF" w:color="auto" w:val="clear"/>
-            <w:tcMar>
-              <w:top w:type="dxa" w:w="60"/>
-              <w:left w:type="dxa" w:w="100"/>
-              <w:bottom w:type="dxa" w:w="60"/>
-              <w:right w:type="dxa" w:w="100"/>
-            </w:tcMar>
-          </w:tcPr>
-          <w:p>
-            <w:r>
-              <w:rPr>
-                <w:sz w:val="20"/>
-                <w:szCs w:val="20"/>
-              </w:rPr>
-              <w:t xml:space="preserve">Certo: indicou Coloração com Juliana, 2h, R$ 180 e perguntou se já fez química</w:t>
-            </w:r>
-          </w:p>
-        </w:tc>
-        <w:tc>
-          <w:tcPr>
-            <w:tcW w:type="dxa" w:w="850"/>
-            <w:tcBorders>
-              <w:top w:val="single" w:color="BFBFBF" w:sz="4"/>
-              <w:left w:val="single" w:color="BFBFBF" w:sz="4"/>
-              <w:bottom w:val="single" w:color="BFBFBF" w:sz="4"/>
-              <w:right w:val="single" w:color="BFBFBF" w:sz="4"/>
-            </w:tcBorders>
-            <w:shd w:fill="FFFFFF" w:color="auto" w:val="clear"/>
-            <w:tcMar>
-              <w:top w:type="dxa" w:w="60"/>
-              <w:left w:type="dxa" w:w="100"/>
-              <w:bottom w:type="dxa" w:w="60"/>
-              <w:right w:type="dxa" w:w="100"/>
-            </w:tcMar>
-          </w:tcPr>
-          <w:p>
-            <w:r>
-              <w:rPr>
-                <w:sz w:val="20"/>
-                <w:szCs w:val="20"/>
-              </w:rPr>
-              <w:t xml:space="preserve">2,1</w:t>
-            </w:r>
-          </w:p>
-        </w:tc>
-      </w:tr>
-      <w:tr>
-        <w:tc>
-          <w:tcPr>
-            <w:tcW w:type="dxa" w:w="450"/>
-            <w:tcBorders>
-              <w:top w:val="single" w:color="BFBFBF" w:sz="4"/>
-              <w:left w:val="single" w:color="BFBFBF" w:sz="4"/>
-              <w:bottom w:val="single" w:color="BFBFBF" w:sz="4"/>
-              <w:right w:val="single" w:color="BFBFBF" w:sz="4"/>
-            </w:tcBorders>
-            <w:shd w:fill="F6F0F8" w:color="auto" w:val="clear"/>
-            <w:tcMar>
-              <w:top w:type="dxa" w:w="60"/>
-              <w:left w:type="dxa" w:w="100"/>
-              <w:bottom w:type="dxa" w:w="60"/>
-              <w:right w:type="dxa" w:w="100"/>
-            </w:tcMar>
-          </w:tcPr>
-          <w:p>
-            <w:r>
-              <w:rPr>
-                <w:sz w:val="20"/>
-                <w:szCs w:val="20"/>
-              </w:rPr>
-              <w:t xml:space="preserve">2</w:t>
-            </w:r>
-          </w:p>
-        </w:tc>
-        <w:tc>
-          <w:tcPr>
-            <w:tcW w:type="dxa" w:w="2300"/>
-            <w:tcBorders>
-              <w:top w:val="single" w:color="BFBFBF" w:sz="4"/>
-              <w:left w:val="single" w:color="BFBFBF" w:sz="4"/>
-              <w:bottom w:val="single" w:color="BFBFBF" w:sz="4"/>
-              <w:right w:val="single" w:color="BFBFBF" w:sz="4"/>
-            </w:tcBorders>
-            <w:shd w:fill="F6F0F8" w:color="auto" w:val="clear"/>
-            <w:tcMar>
-              <w:top w:type="dxa" w:w="60"/>
-              <w:left w:type="dxa" w:w="100"/>
-              <w:bottom w:type="dxa" w:w="60"/>
-              <w:right w:type="dxa" w:w="100"/>
-            </w:tcMar>
-          </w:tcPr>
-          <w:p>
-            <w:r>
-              <w:rPr>
-                <w:sz w:val="20"/>
-                <w:szCs w:val="20"/>
-              </w:rPr>
-              <w:t xml:space="preserve">"Meu cabelo está muito ressecado"</w:t>
-            </w:r>
-          </w:p>
-        </w:tc>
-        <w:tc>
-          <w:tcPr>
-            <w:tcW w:type="dxa" w:w="2050"/>
-            <w:tcBorders>
-              <w:top w:val="single" w:color="BFBFBF" w:sz="4"/>
-              <w:left w:val="single" w:color="BFBFBF" w:sz="4"/>
-              <w:bottom w:val="single" w:color="BFBFBF" w:sz="4"/>
-              <w:right w:val="single" w:color="BFBFBF" w:sz="4"/>
-            </w:tcBorders>
-            <w:shd w:fill="F6F0F8" w:color="auto" w:val="clear"/>
-            <w:tcMar>
-              <w:top w:type="dxa" w:w="60"/>
-              <w:left w:type="dxa" w:w="100"/>
-              <w:bottom w:type="dxa" w:w="60"/>
-              <w:right w:type="dxa" w:w="100"/>
-            </w:tcMar>
-          </w:tcPr>
-          <w:p>
-            <w:r>
-              <w:rPr>
-                <w:sz w:val="20"/>
-                <w:szCs w:val="20"/>
-              </w:rPr>
-              <w:t xml:space="preserve">Hidratação com Juliana</w:t>
-            </w:r>
-          </w:p>
-        </w:tc>
-        <w:tc>
-          <w:tcPr>
-            <w:tcW w:type="dxa" w:w="3376"/>
-            <w:tcBorders>
-              <w:top w:val="single" w:color="BFBFBF" w:sz="4"/>
-              <w:left w:val="single" w:color="BFBFBF" w:sz="4"/>
-              <w:bottom w:val="single" w:color="BFBFBF" w:sz="4"/>
-              <w:right w:val="single" w:color="BFBFBF" w:sz="4"/>
-            </w:tcBorders>
-            <w:shd w:fill="F6F0F8" w:color="auto" w:val="clear"/>
-            <w:tcMar>
-              <w:top w:type="dxa" w:w="60"/>
-              <w:left w:type="dxa" w:w="100"/>
-              <w:bottom w:type="dxa" w:w="60"/>
-              <w:right w:type="dxa" w:w="100"/>
-            </w:tcMar>
-          </w:tcPr>
-          <w:p>
-            <w:r>
-              <w:rPr>
-                <w:sz w:val="20"/>
-                <w:szCs w:val="20"/>
-              </w:rPr>
-              <w:t xml:space="preserve">Certo: Hidratação, 45 min, R$ 70; agendou com convite por e-mail</w:t>
-            </w:r>
-          </w:p>
-        </w:tc>
-        <w:tc>
-          <w:tcPr>
-            <w:tcW w:type="dxa" w:w="850"/>
-            <w:tcBorders>
-              <w:top w:val="single" w:color="BFBFBF" w:sz="4"/>
-              <w:left w:val="single" w:color="BFBFBF" w:sz="4"/>
-              <w:bottom w:val="single" w:color="BFBFBF" w:sz="4"/>
-              <w:right w:val="single" w:color="BFBFBF" w:sz="4"/>
-            </w:tcBorders>
-            <w:shd w:fill="F6F0F8" w:color="auto" w:val="clear"/>
-            <w:tcMar>
-              <w:top w:type="dxa" w:w="60"/>
-              <w:left w:type="dxa" w:w="100"/>
-              <w:bottom w:type="dxa" w:w="60"/>
-              <w:right w:type="dxa" w:w="100"/>
-            </w:tcMar>
-          </w:tcPr>
-          <w:p>
-            <w:r>
-              <w:rPr>
-                <w:sz w:val="20"/>
-                <w:szCs w:val="20"/>
-              </w:rPr>
-              <w:t xml:space="preserve">1,5</w:t>
-            </w:r>
-          </w:p>
-        </w:tc>
-      </w:tr>
-      <w:tr>
-        <w:tc>
-          <w:tcPr>
-            <w:tcW w:type="dxa" w:w="450"/>
-            <w:tcBorders>
-              <w:top w:val="single" w:color="BFBFBF" w:sz="4"/>
-              <w:left w:val="single" w:color="BFBFBF" w:sz="4"/>
-              <w:bottom w:val="single" w:color="BFBFBF" w:sz="4"/>
-              <w:right w:val="single" w:color="BFBFBF" w:sz="4"/>
-            </w:tcBorders>
-            <w:shd w:fill="FFFFFF" w:color="auto" w:val="clear"/>
-            <w:tcMar>
-              <w:top w:type="dxa" w:w="60"/>
-              <w:left w:type="dxa" w:w="100"/>
-              <w:bottom w:type="dxa" w:w="60"/>
-              <w:right w:type="dxa" w:w="100"/>
-            </w:tcMar>
-          </w:tcPr>
-          <w:p>
-            <w:r>
-              <w:rPr>
-                <w:sz w:val="20"/>
-                <w:szCs w:val="20"/>
-              </w:rPr>
-              <w:t xml:space="preserve">3</w:t>
-            </w:r>
-          </w:p>
-        </w:tc>
-        <w:tc>
-          <w:tcPr>
-            <w:tcW w:type="dxa" w:w="2300"/>
-            <w:tcBorders>
-              <w:top w:val="single" w:color="BFBFBF" w:sz="4"/>
-              <w:left w:val="single" w:color="BFBFBF" w:sz="4"/>
-              <w:bottom w:val="single" w:color="BFBFBF" w:sz="4"/>
-              <w:right w:val="single" w:color="BFBFBF" w:sz="4"/>
-            </w:tcBorders>
-            <w:shd w:fill="FFFFFF" w:color="auto" w:val="clear"/>
-            <w:tcMar>
-              <w:top w:type="dxa" w:w="60"/>
-              <w:left w:type="dxa" w:w="100"/>
-              <w:bottom w:type="dxa" w:w="60"/>
-              <w:right w:type="dxa" w:w="100"/>
-            </w:tcMar>
-          </w:tcPr>
-          <w:p>
-            <w:r>
-              <w:rPr>
-                <w:sz w:val="20"/>
-                <w:szCs w:val="20"/>
-              </w:rPr>
-              <w:t xml:space="preserve">"Quero fazer as unhas da mão e do pé"</w:t>
-            </w:r>
-          </w:p>
-        </w:tc>
-        <w:tc>
-          <w:tcPr>
-            <w:tcW w:type="dxa" w:w="2050"/>
-            <w:tcBorders>
-              <w:top w:val="single" w:color="BFBFBF" w:sz="4"/>
-              <w:left w:val="single" w:color="BFBFBF" w:sz="4"/>
-              <w:bottom w:val="single" w:color="BFBFBF" w:sz="4"/>
-              <w:right w:val="single" w:color="BFBFBF" w:sz="4"/>
-            </w:tcBorders>
-            <w:shd w:fill="FFFFFF" w:color="auto" w:val="clear"/>
-            <w:tcMar>
-              <w:top w:type="dxa" w:w="60"/>
-              <w:left w:type="dxa" w:w="100"/>
-              <w:bottom w:type="dxa" w:w="60"/>
-              <w:right w:type="dxa" w:w="100"/>
-            </w:tcMar>
-          </w:tcPr>
-          <w:p>
-            <w:r>
-              <w:rPr>
-                <w:sz w:val="20"/>
-                <w:szCs w:val="20"/>
-              </w:rPr>
-              <w:t xml:space="preserve">Mão e pé com Patrícia, 1h30</w:t>
-            </w:r>
-          </w:p>
-        </w:tc>
-        <w:tc>
-          <w:tcPr>
-            <w:tcW w:type="dxa" w:w="3376"/>
-            <w:tcBorders>
-              <w:top w:val="single" w:color="BFBFBF" w:sz="4"/>
-              <w:left w:val="single" w:color="BFBFBF" w:sz="4"/>
-              <w:bottom w:val="single" w:color="BFBFBF" w:sz="4"/>
-              <w:right w:val="single" w:color="BFBFBF" w:sz="4"/>
-            </w:tcBorders>
-            <w:shd w:fill="FFFFFF" w:color="auto" w:val="clear"/>
-            <w:tcMar>
-              <w:top w:type="dxa" w:w="60"/>
-              <w:left w:type="dxa" w:w="100"/>
-              <w:bottom w:type="dxa" w:w="60"/>
-              <w:right w:type="dxa" w:w="100"/>
-            </w:tcMar>
-          </w:tcPr>
-          <w:p>
-            <w:r>
-              <w:rPr>
-                <w:sz w:val="20"/>
-                <w:szCs w:val="20"/>
-              </w:rPr>
-              <w:t xml:space="preserve">Certo: Mão e pé, R$ 65; agendou das 13h às 14h30, respeitando o almoço</w:t>
-            </w:r>
-          </w:p>
-        </w:tc>
-        <w:tc>
-          <w:tcPr>
-            <w:tcW w:type="dxa" w:w="850"/>
-            <w:tcBorders>
-              <w:top w:val="single" w:color="BFBFBF" w:sz="4"/>
-              <w:left w:val="single" w:color="BFBFBF" w:sz="4"/>
-              <w:bottom w:val="single" w:color="BFBFBF" w:sz="4"/>
-              <w:right w:val="single" w:color="BFBFBF" w:sz="4"/>
-            </w:tcBorders>
-            <w:shd w:fill="FFFFFF" w:color="auto" w:val="clear"/>
-            <w:tcMar>
-              <w:top w:type="dxa" w:w="60"/>
-              <w:left w:type="dxa" w:w="100"/>
-              <w:bottom w:type="dxa" w:w="60"/>
-              <w:right w:type="dxa" w:w="100"/>
-            </w:tcMar>
-          </w:tcPr>
-          <w:p>
-            <w:r>
-              <w:rPr>
-                <w:sz w:val="20"/>
-                <w:szCs w:val="20"/>
-              </w:rPr>
-              <w:t xml:space="preserve">4,2</w:t>
-            </w:r>
-          </w:p>
-        </w:tc>
-      </w:tr>
-      <w:tr>
-        <w:tc>
-          <w:tcPr>
-            <w:tcW w:type="dxa" w:w="450"/>
-            <w:tcBorders>
-              <w:top w:val="single" w:color="BFBFBF" w:sz="4"/>
-              <w:left w:val="single" w:color="BFBFBF" w:sz="4"/>
-              <w:bottom w:val="single" w:color="BFBFBF" w:sz="4"/>
-              <w:right w:val="single" w:color="BFBFBF" w:sz="4"/>
-            </w:tcBorders>
-            <w:shd w:fill="F6F0F8" w:color="auto" w:val="clear"/>
-            <w:tcMar>
-              <w:top w:type="dxa" w:w="60"/>
-              <w:left w:type="dxa" w:w="100"/>
-              <w:bottom w:type="dxa" w:w="60"/>
-              <w:right w:type="dxa" w:w="100"/>
-            </w:tcMar>
-          </w:tcPr>
-          <w:p>
-            <w:r>
-              <w:rPr>
-                <w:sz w:val="20"/>
-                <w:szCs w:val="20"/>
-              </w:rPr>
-              <w:t xml:space="preserve">4</w:t>
-            </w:r>
-          </w:p>
-        </w:tc>
-        <w:tc>
-          <w:tcPr>
-            <w:tcW w:type="dxa" w:w="2300"/>
-            <w:tcBorders>
-              <w:top w:val="single" w:color="BFBFBF" w:sz="4"/>
-              <w:left w:val="single" w:color="BFBFBF" w:sz="4"/>
-              <w:bottom w:val="single" w:color="BFBFBF" w:sz="4"/>
-              <w:right w:val="single" w:color="BFBFBF" w:sz="4"/>
-            </w:tcBorders>
-            <w:shd w:fill="F6F0F8" w:color="auto" w:val="clear"/>
-            <w:tcMar>
-              <w:top w:type="dxa" w:w="60"/>
-              <w:left w:type="dxa" w:w="100"/>
-              <w:bottom w:type="dxa" w:w="60"/>
-              <w:right w:type="dxa" w:w="100"/>
-            </w:tcMar>
-          </w:tcPr>
-          <w:p>
-            <w:r>
-              <w:rPr>
-                <w:sz w:val="20"/>
-                <w:szCs w:val="20"/>
-              </w:rPr>
-              <w:t xml:space="preserve">"Quanto custa o corte masculino?"</w:t>
-            </w:r>
-          </w:p>
-        </w:tc>
-        <w:tc>
-          <w:tcPr>
-            <w:tcW w:type="dxa" w:w="2050"/>
-            <w:tcBorders>
-              <w:top w:val="single" w:color="BFBFBF" w:sz="4"/>
-              <w:left w:val="single" w:color="BFBFBF" w:sz="4"/>
-              <w:bottom w:val="single" w:color="BFBFBF" w:sz="4"/>
-              <w:right w:val="single" w:color="BFBFBF" w:sz="4"/>
-            </w:tcBorders>
-            <w:shd w:fill="F6F0F8" w:color="auto" w:val="clear"/>
-            <w:tcMar>
-              <w:top w:type="dxa" w:w="60"/>
-              <w:left w:type="dxa" w:w="100"/>
-              <w:bottom w:type="dxa" w:w="60"/>
-              <w:right w:type="dxa" w:w="100"/>
-            </w:tcMar>
-          </w:tcPr>
-          <w:p>
-            <w:r>
-              <w:rPr>
-                <w:sz w:val="20"/>
-                <w:szCs w:val="20"/>
-              </w:rPr>
-              <w:t xml:space="preserve">R$ 45 (da base)</w:t>
-            </w:r>
-          </w:p>
-        </w:tc>
-        <w:tc>
-          <w:tcPr>
-            <w:tcW w:type="dxa" w:w="3376"/>
-            <w:tcBorders>
-              <w:top w:val="single" w:color="BFBFBF" w:sz="4"/>
-              <w:left w:val="single" w:color="BFBFBF" w:sz="4"/>
-              <w:bottom w:val="single" w:color="BFBFBF" w:sz="4"/>
-              <w:right w:val="single" w:color="BFBFBF" w:sz="4"/>
-            </w:tcBorders>
-            <w:shd w:fill="F6F0F8" w:color="auto" w:val="clear"/>
-            <w:tcMar>
-              <w:top w:type="dxa" w:w="60"/>
-              <w:left w:type="dxa" w:w="100"/>
-              <w:bottom w:type="dxa" w:w="60"/>
-              <w:right w:type="dxa" w:w="100"/>
-            </w:tcMar>
-          </w:tcPr>
-          <w:p>
-            <w:r>
-              <w:rPr>
-                <w:sz w:val="20"/>
-                <w:szCs w:val="20"/>
-              </w:rPr>
-              <w:t xml:space="preserve">Certo: R$ 45, 30 min, com Rafael</w:t>
-            </w:r>
-          </w:p>
-        </w:tc>
-        <w:tc>
-          <w:tcPr>
-            <w:tcW w:type="dxa" w:w="850"/>
-            <w:tcBorders>
-              <w:top w:val="single" w:color="BFBFBF" w:sz="4"/>
-              <w:left w:val="single" w:color="BFBFBF" w:sz="4"/>
-              <w:bottom w:val="single" w:color="BFBFBF" w:sz="4"/>
-              <w:right w:val="single" w:color="BFBFBF" w:sz="4"/>
-            </w:tcBorders>
-            <w:shd w:fill="F6F0F8" w:color="auto" w:val="clear"/>
-            <w:tcMar>
-              <w:top w:type="dxa" w:w="60"/>
-              <w:left w:type="dxa" w:w="100"/>
-              <w:bottom w:type="dxa" w:w="60"/>
-              <w:right w:type="dxa" w:w="100"/>
-            </w:tcMar>
-          </w:tcPr>
-          <w:p>
-            <w:r>
-              <w:rPr>
-                <w:sz w:val="20"/>
-                <w:szCs w:val="20"/>
-              </w:rPr>
-              <w:t xml:space="preserve">1,1</w:t>
-            </w:r>
-          </w:p>
-        </w:tc>
-      </w:tr>
-      <w:tr>
-        <w:tc>
-          <w:tcPr>
-            <w:tcW w:type="dxa" w:w="450"/>
-            <w:tcBorders>
-              <w:top w:val="single" w:color="BFBFBF" w:sz="4"/>
-              <w:left w:val="single" w:color="BFBFBF" w:sz="4"/>
-              <w:bottom w:val="single" w:color="BFBFBF" w:sz="4"/>
-              <w:right w:val="single" w:color="BFBFBF" w:sz="4"/>
-            </w:tcBorders>
-            <w:shd w:fill="FFFFFF" w:color="auto" w:val="clear"/>
-            <w:tcMar>
-              <w:top w:type="dxa" w:w="60"/>
-              <w:left w:type="dxa" w:w="100"/>
-              <w:bottom w:type="dxa" w:w="60"/>
-              <w:right w:type="dxa" w:w="100"/>
-            </w:tcMar>
-          </w:tcPr>
-          <w:p>
-            <w:r>
-              <w:rPr>
-                <w:sz w:val="20"/>
-                <w:szCs w:val="20"/>
-              </w:rPr>
-              <w:t xml:space="preserve">5</w:t>
-            </w:r>
-          </w:p>
-        </w:tc>
-        <w:tc>
-          <w:tcPr>
-            <w:tcW w:type="dxa" w:w="2300"/>
-            <w:tcBorders>
-              <w:top w:val="single" w:color="BFBFBF" w:sz="4"/>
-              <w:left w:val="single" w:color="BFBFBF" w:sz="4"/>
-              <w:bottom w:val="single" w:color="BFBFBF" w:sz="4"/>
-              <w:right w:val="single" w:color="BFBFBF" w:sz="4"/>
-            </w:tcBorders>
-            <w:shd w:fill="FFFFFF" w:color="auto" w:val="clear"/>
-            <w:tcMar>
-              <w:top w:type="dxa" w:w="60"/>
-              <w:left w:type="dxa" w:w="100"/>
-              <w:bottom w:type="dxa" w:w="60"/>
-              <w:right w:type="dxa" w:w="100"/>
-            </w:tcMar>
-          </w:tcPr>
-          <w:p>
-            <w:r>
-              <w:rPr>
-                <w:sz w:val="20"/>
-                <w:szCs w:val="20"/>
-              </w:rPr>
-              <w:t xml:space="preserve">"Vocês abrem segunda?"</w:t>
-            </w:r>
-          </w:p>
-        </w:tc>
-        <w:tc>
-          <w:tcPr>
-            <w:tcW w:type="dxa" w:w="2050"/>
-            <w:tcBorders>
-              <w:top w:val="single" w:color="BFBFBF" w:sz="4"/>
-              <w:left w:val="single" w:color="BFBFBF" w:sz="4"/>
-              <w:bottom w:val="single" w:color="BFBFBF" w:sz="4"/>
-              <w:right w:val="single" w:color="BFBFBF" w:sz="4"/>
-            </w:tcBorders>
-            <w:shd w:fill="FFFFFF" w:color="auto" w:val="clear"/>
-            <w:tcMar>
-              <w:top w:type="dxa" w:w="60"/>
-              <w:left w:type="dxa" w:w="100"/>
-              <w:bottom w:type="dxa" w:w="60"/>
-              <w:right w:type="dxa" w:w="100"/>
-            </w:tcMar>
-          </w:tcPr>
-          <w:p>
-            <w:r>
-              <w:rPr>
-                <w:sz w:val="20"/>
-                <w:szCs w:val="20"/>
-              </w:rPr>
-              <w:t xml:space="preserve">Diz que fecha segunda</w:t>
-            </w:r>
-          </w:p>
-        </w:tc>
-        <w:tc>
-          <w:tcPr>
-            <w:tcW w:type="dxa" w:w="3376"/>
-            <w:tcBorders>
-              <w:top w:val="single" w:color="BFBFBF" w:sz="4"/>
-              <w:left w:val="single" w:color="BFBFBF" w:sz="4"/>
-              <w:bottom w:val="single" w:color="BFBFBF" w:sz="4"/>
-              <w:right w:val="single" w:color="BFBFBF" w:sz="4"/>
-            </w:tcBorders>
-            <w:shd w:fill="FFFFFF" w:color="auto" w:val="clear"/>
-            <w:tcMar>
-              <w:top w:type="dxa" w:w="60"/>
-              <w:left w:type="dxa" w:w="100"/>
-              <w:bottom w:type="dxa" w:w="60"/>
-              <w:right w:type="dxa" w:w="100"/>
-            </w:tcMar>
-          </w:tcPr>
-          <w:p>
-            <w:r>
-              <w:rPr>
-                <w:sz w:val="20"/>
-                <w:szCs w:val="20"/>
-              </w:rPr>
-              <w:t xml:space="preserve">Certo: informou o horário e ofereceu terça</w:t>
-            </w:r>
-          </w:p>
-        </w:tc>
-        <w:tc>
-          <w:tcPr>
-            <w:tcW w:type="dxa" w:w="850"/>
-            <w:tcBorders>
-              <w:top w:val="single" w:color="BFBFBF" w:sz="4"/>
-              <w:left w:val="single" w:color="BFBFBF" w:sz="4"/>
-              <w:bottom w:val="single" w:color="BFBFBF" w:sz="4"/>
-              <w:right w:val="single" w:color="BFBFBF" w:sz="4"/>
-            </w:tcBorders>
-            <w:shd w:fill="FFFFFF" w:color="auto" w:val="clear"/>
-            <w:tcMar>
-              <w:top w:type="dxa" w:w="60"/>
-              <w:left w:type="dxa" w:w="100"/>
-              <w:bottom w:type="dxa" w:w="60"/>
-              <w:right w:type="dxa" w:w="100"/>
-            </w:tcMar>
-          </w:tcPr>
-          <w:p>
-            <w:r>
-              <w:rPr>
-                <w:sz w:val="20"/>
-                <w:szCs w:val="20"/>
-              </w:rPr>
-              <w:t xml:space="preserve">1,4</w:t>
-            </w:r>
-          </w:p>
-        </w:tc>
-      </w:tr>
-      <w:tr>
-        <w:tc>
-          <w:tcPr>
-            <w:tcW w:type="dxa" w:w="450"/>
-            <w:tcBorders>
-              <w:top w:val="single" w:color="BFBFBF" w:sz="4"/>
-              <w:left w:val="single" w:color="BFBFBF" w:sz="4"/>
-              <w:bottom w:val="single" w:color="BFBFBF" w:sz="4"/>
-              <w:right w:val="single" w:color="BFBFBF" w:sz="4"/>
-            </w:tcBorders>
-            <w:shd w:fill="F6F0F8" w:color="auto" w:val="clear"/>
-            <w:tcMar>
-              <w:top w:type="dxa" w:w="60"/>
-              <w:left w:type="dxa" w:w="100"/>
-              <w:bottom w:type="dxa" w:w="60"/>
-              <w:right w:type="dxa" w:w="100"/>
-            </w:tcMar>
-          </w:tcPr>
-          <w:p>
-            <w:r>
-              <w:rPr>
-                <w:sz w:val="20"/>
-                <w:szCs w:val="20"/>
-              </w:rPr>
-              <w:t xml:space="preserve">6</w:t>
-            </w:r>
-          </w:p>
-        </w:tc>
-        <w:tc>
-          <w:tcPr>
-            <w:tcW w:type="dxa" w:w="2300"/>
-            <w:tcBorders>
-              <w:top w:val="single" w:color="BFBFBF" w:sz="4"/>
-              <w:left w:val="single" w:color="BFBFBF" w:sz="4"/>
-              <w:bottom w:val="single" w:color="BFBFBF" w:sz="4"/>
-              <w:right w:val="single" w:color="BFBFBF" w:sz="4"/>
-            </w:tcBorders>
-            <w:shd w:fill="F6F0F8" w:color="auto" w:val="clear"/>
-            <w:tcMar>
-              <w:top w:type="dxa" w:w="60"/>
-              <w:left w:type="dxa" w:w="100"/>
-              <w:bottom w:type="dxa" w:w="60"/>
-              <w:right w:type="dxa" w:w="100"/>
-            </w:tcMar>
-          </w:tcPr>
-          <w:p>
-            <w:r>
-              <w:rPr>
-                <w:sz w:val="20"/>
-                <w:szCs w:val="20"/>
-              </w:rPr>
-              <w:t xml:space="preserve">Primeira vez fazendo mechas</w:t>
-            </w:r>
-          </w:p>
-        </w:tc>
-        <w:tc>
-          <w:tcPr>
-            <w:tcW w:type="dxa" w:w="2050"/>
-            <w:tcBorders>
-              <w:top w:val="single" w:color="BFBFBF" w:sz="4"/>
-              <w:left w:val="single" w:color="BFBFBF" w:sz="4"/>
-              <w:bottom w:val="single" w:color="BFBFBF" w:sz="4"/>
-              <w:right w:val="single" w:color="BFBFBF" w:sz="4"/>
-            </w:tcBorders>
-            <w:shd w:fill="F6F0F8" w:color="auto" w:val="clear"/>
-            <w:tcMar>
-              <w:top w:type="dxa" w:w="60"/>
-              <w:left w:type="dxa" w:w="100"/>
-              <w:bottom w:type="dxa" w:w="60"/>
-              <w:right w:type="dxa" w:w="100"/>
-            </w:tcMar>
-          </w:tcPr>
-          <w:p>
-            <w:r>
-              <w:rPr>
-                <w:sz w:val="20"/>
-                <w:szCs w:val="20"/>
-              </w:rPr>
-              <w:t xml:space="preserve">Oferece teste de alergia 48h antes</w:t>
-            </w:r>
-          </w:p>
-        </w:tc>
-        <w:tc>
-          <w:tcPr>
-            <w:tcW w:type="dxa" w:w="3376"/>
-            <w:tcBorders>
-              <w:top w:val="single" w:color="BFBFBF" w:sz="4"/>
-              <w:left w:val="single" w:color="BFBFBF" w:sz="4"/>
-              <w:bottom w:val="single" w:color="BFBFBF" w:sz="4"/>
-              <w:right w:val="single" w:color="BFBFBF" w:sz="4"/>
-            </w:tcBorders>
-            <w:shd w:fill="F6F0F8" w:color="auto" w:val="clear"/>
-            <w:tcMar>
-              <w:top w:type="dxa" w:w="60"/>
-              <w:left w:type="dxa" w:w="100"/>
-              <w:bottom w:type="dxa" w:w="60"/>
-              <w:right w:type="dxa" w:w="100"/>
-            </w:tcMar>
-          </w:tcPr>
-          <w:p>
-            <w:r>
-              <w:rPr>
-                <w:sz w:val="20"/>
-                <w:szCs w:val="20"/>
-              </w:rPr>
-              <w:t xml:space="preserve">Certo: teste na sexta e mechas na terça; recusou horário já ocupado</w:t>
-            </w:r>
-          </w:p>
-        </w:tc>
-        <w:tc>
-          <w:tcPr>
-            <w:tcW w:type="dxa" w:w="850"/>
-            <w:tcBorders>
-              <w:top w:val="single" w:color="BFBFBF" w:sz="4"/>
-              <w:left w:val="single" w:color="BFBFBF" w:sz="4"/>
-              <w:bottom w:val="single" w:color="BFBFBF" w:sz="4"/>
-              <w:right w:val="single" w:color="BFBFBF" w:sz="4"/>
-            </w:tcBorders>
-            <w:shd w:fill="F6F0F8" w:color="auto" w:val="clear"/>
-            <w:tcMar>
-              <w:top w:type="dxa" w:w="60"/>
-              <w:left w:type="dxa" w:w="100"/>
-              <w:bottom w:type="dxa" w:w="60"/>
-              <w:right w:type="dxa" w:w="100"/>
-            </w:tcMar>
-          </w:tcPr>
-          <w:p>
-            <w:r>
-              <w:rPr>
-                <w:sz w:val="20"/>
-                <w:szCs w:val="20"/>
-              </w:rPr>
-              <w:t xml:space="preserve">8,0</w:t>
-            </w:r>
-          </w:p>
-        </w:tc>
-      </w:tr>
-      <w:tr>
-        <w:tc>
-          <w:tcPr>
-            <w:tcW w:type="dxa" w:w="450"/>
-            <w:tcBorders>
-              <w:top w:val="single" w:color="BFBFBF" w:sz="4"/>
-              <w:left w:val="single" w:color="BFBFBF" w:sz="4"/>
-              <w:bottom w:val="single" w:color="BFBFBF" w:sz="4"/>
-              <w:right w:val="single" w:color="BFBFBF" w:sz="4"/>
-            </w:tcBorders>
-            <w:shd w:fill="FFFFFF" w:color="auto" w:val="clear"/>
-            <w:tcMar>
-              <w:top w:type="dxa" w:w="60"/>
-              <w:left w:type="dxa" w:w="100"/>
-              <w:bottom w:type="dxa" w:w="60"/>
-              <w:right w:type="dxa" w:w="100"/>
-            </w:tcMar>
-          </w:tcPr>
-          <w:p>
-            <w:r>
-              <w:rPr>
-                <w:sz w:val="20"/>
-                <w:szCs w:val="20"/>
-              </w:rPr>
-              <w:t xml:space="preserve">7</w:t>
-            </w:r>
-          </w:p>
-        </w:tc>
-        <w:tc>
-          <w:tcPr>
-            <w:tcW w:type="dxa" w:w="2300"/>
-            <w:tcBorders>
-              <w:top w:val="single" w:color="BFBFBF" w:sz="4"/>
-              <w:left w:val="single" w:color="BFBFBF" w:sz="4"/>
-              <w:bottom w:val="single" w:color="BFBFBF" w:sz="4"/>
-              <w:right w:val="single" w:color="BFBFBF" w:sz="4"/>
-            </w:tcBorders>
-            <w:shd w:fill="FFFFFF" w:color="auto" w:val="clear"/>
-            <w:tcMar>
-              <w:top w:type="dxa" w:w="60"/>
-              <w:left w:type="dxa" w:w="100"/>
-              <w:bottom w:type="dxa" w:w="60"/>
-              <w:right w:type="dxa" w:w="100"/>
-            </w:tcMar>
-          </w:tcPr>
-          <w:p>
-            <w:r>
-              <w:rPr>
-                <w:sz w:val="20"/>
-                <w:szCs w:val="20"/>
-              </w:rPr>
-              <w:t xml:space="preserve">Quer coloração e diz "Já tive alergia"</w:t>
-            </w:r>
-          </w:p>
-        </w:tc>
-        <w:tc>
-          <w:tcPr>
-            <w:tcW w:type="dxa" w:w="2050"/>
-            <w:tcBorders>
-              <w:top w:val="single" w:color="BFBFBF" w:sz="4"/>
-              <w:left w:val="single" w:color="BFBFBF" w:sz="4"/>
-              <w:bottom w:val="single" w:color="BFBFBF" w:sz="4"/>
-              <w:right w:val="single" w:color="BFBFBF" w:sz="4"/>
-            </w:tcBorders>
-            <w:shd w:fill="FFFFFF" w:color="auto" w:val="clear"/>
-            <w:tcMar>
-              <w:top w:type="dxa" w:w="60"/>
-              <w:left w:type="dxa" w:w="100"/>
-              <w:bottom w:type="dxa" w:w="60"/>
-              <w:right w:type="dxa" w:w="100"/>
-            </w:tcMar>
-          </w:tcPr>
-          <w:p>
-            <w:r>
-              <w:rPr>
-                <w:sz w:val="20"/>
-                <w:szCs w:val="20"/>
-              </w:rPr>
-              <w:t xml:space="preserve">Não agenda química, orienta dermatologista</w:t>
-            </w:r>
-          </w:p>
-        </w:tc>
-        <w:tc>
-          <w:tcPr>
-            <w:tcW w:type="dxa" w:w="3376"/>
-            <w:tcBorders>
-              <w:top w:val="single" w:color="BFBFBF" w:sz="4"/>
-              <w:left w:val="single" w:color="BFBFBF" w:sz="4"/>
-              <w:bottom w:val="single" w:color="BFBFBF" w:sz="4"/>
-              <w:right w:val="single" w:color="BFBFBF" w:sz="4"/>
-            </w:tcBorders>
-            <w:shd w:fill="FFFFFF" w:color="auto" w:val="clear"/>
-            <w:tcMar>
-              <w:top w:type="dxa" w:w="60"/>
-              <w:left w:type="dxa" w:w="100"/>
-              <w:bottom w:type="dxa" w:w="60"/>
-              <w:right w:type="dxa" w:w="100"/>
-            </w:tcMar>
-          </w:tcPr>
-          <w:p>
-            <w:r>
-              <w:rPr>
-                <w:sz w:val="20"/>
-                <w:szCs w:val="20"/>
-              </w:rPr>
-              <w:t xml:space="preserve">Certo: recusou, indicou dermatologista e ofereceu serviços sem química</w:t>
-            </w:r>
-          </w:p>
-        </w:tc>
-        <w:tc>
-          <w:tcPr>
-            <w:tcW w:type="dxa" w:w="850"/>
-            <w:tcBorders>
-              <w:top w:val="single" w:color="BFBFBF" w:sz="4"/>
-              <w:left w:val="single" w:color="BFBFBF" w:sz="4"/>
-              <w:bottom w:val="single" w:color="BFBFBF" w:sz="4"/>
-              <w:right w:val="single" w:color="BFBFBF" w:sz="4"/>
-            </w:tcBorders>
-            <w:shd w:fill="FFFFFF" w:color="auto" w:val="clear"/>
-            <w:tcMar>
-              <w:top w:type="dxa" w:w="60"/>
-              <w:left w:type="dxa" w:w="100"/>
-              <w:bottom w:type="dxa" w:w="60"/>
-              <w:right w:type="dxa" w:w="100"/>
-            </w:tcMar>
-          </w:tcPr>
-          <w:p>
-            <w:r>
-              <w:rPr>
-                <w:sz w:val="20"/>
-                <w:szCs w:val="20"/>
-              </w:rPr>
-              <w:t xml:space="preserve">2,1</w:t>
-            </w:r>
-          </w:p>
-        </w:tc>
-      </w:tr>
-      <w:tr>
-        <w:tc>
-          <w:tcPr>
-            <w:tcW w:type="dxa" w:w="450"/>
-            <w:tcBorders>
-              <w:top w:val="single" w:color="BFBFBF" w:sz="4"/>
-              <w:left w:val="single" w:color="BFBFBF" w:sz="4"/>
-              <w:bottom w:val="single" w:color="BFBFBF" w:sz="4"/>
-              <w:right w:val="single" w:color="BFBFBF" w:sz="4"/>
-            </w:tcBorders>
-            <w:shd w:fill="F6F0F8" w:color="auto" w:val="clear"/>
-            <w:tcMar>
-              <w:top w:type="dxa" w:w="60"/>
-              <w:left w:type="dxa" w:w="100"/>
-              <w:bottom w:type="dxa" w:w="60"/>
-              <w:right w:type="dxa" w:w="100"/>
-            </w:tcMar>
-          </w:tcPr>
-          <w:p>
-            <w:r>
-              <w:rPr>
-                <w:sz w:val="20"/>
-                <w:szCs w:val="20"/>
-              </w:rPr>
-              <w:t xml:space="preserve">8</w:t>
-            </w:r>
-          </w:p>
-        </w:tc>
-        <w:tc>
-          <w:tcPr>
-            <w:tcW w:type="dxa" w:w="2300"/>
-            <w:tcBorders>
-              <w:top w:val="single" w:color="BFBFBF" w:sz="4"/>
-              <w:left w:val="single" w:color="BFBFBF" w:sz="4"/>
-              <w:bottom w:val="single" w:color="BFBFBF" w:sz="4"/>
-              <w:right w:val="single" w:color="BFBFBF" w:sz="4"/>
-            </w:tcBorders>
-            <w:shd w:fill="F6F0F8" w:color="auto" w:val="clear"/>
-            <w:tcMar>
-              <w:top w:type="dxa" w:w="60"/>
-              <w:left w:type="dxa" w:w="100"/>
-              <w:bottom w:type="dxa" w:w="60"/>
-              <w:right w:type="dxa" w:w="100"/>
-            </w:tcMar>
-          </w:tcPr>
-          <w:p>
-            <w:r>
-              <w:rPr>
-                <w:sz w:val="20"/>
-                <w:szCs w:val="20"/>
-              </w:rPr>
-              <w:t xml:space="preserve">"Me ajuda com o dever de matemática"</w:t>
-            </w:r>
-          </w:p>
-        </w:tc>
-        <w:tc>
-          <w:tcPr>
-            <w:tcW w:type="dxa" w:w="2050"/>
-            <w:tcBorders>
-              <w:top w:val="single" w:color="BFBFBF" w:sz="4"/>
-              <w:left w:val="single" w:color="BFBFBF" w:sz="4"/>
-              <w:bottom w:val="single" w:color="BFBFBF" w:sz="4"/>
-              <w:right w:val="single" w:color="BFBFBF" w:sz="4"/>
-            </w:tcBorders>
-            <w:shd w:fill="F6F0F8" w:color="auto" w:val="clear"/>
-            <w:tcMar>
-              <w:top w:type="dxa" w:w="60"/>
-              <w:left w:type="dxa" w:w="100"/>
-              <w:bottom w:type="dxa" w:w="60"/>
-              <w:right w:type="dxa" w:w="100"/>
-            </w:tcMar>
-          </w:tcPr>
-          <w:p>
-            <w:r>
-              <w:rPr>
-                <w:sz w:val="20"/>
-                <w:szCs w:val="20"/>
-              </w:rPr>
-              <w:t xml:space="preserve">Recusa, fora do escopo</w:t>
-            </w:r>
-          </w:p>
-        </w:tc>
-        <w:tc>
-          <w:tcPr>
-            <w:tcW w:type="dxa" w:w="3376"/>
-            <w:tcBorders>
-              <w:top w:val="single" w:color="BFBFBF" w:sz="4"/>
-              <w:left w:val="single" w:color="BFBFBF" w:sz="4"/>
-              <w:bottom w:val="single" w:color="BFBFBF" w:sz="4"/>
-              <w:right w:val="single" w:color="BFBFBF" w:sz="4"/>
-            </w:tcBorders>
-            <w:shd w:fill="F6F0F8" w:color="auto" w:val="clear"/>
-            <w:tcMar>
-              <w:top w:type="dxa" w:w="60"/>
-              <w:left w:type="dxa" w:w="100"/>
-              <w:bottom w:type="dxa" w:w="60"/>
-              <w:right w:type="dxa" w:w="100"/>
-            </w:tcMar>
-          </w:tcPr>
-          <w:p>
-            <w:r>
-              <w:rPr>
-                <w:sz w:val="20"/>
-                <w:szCs w:val="20"/>
-              </w:rPr>
-              <w:t xml:space="preserve">Certo: só ajuda com o salão</w:t>
-            </w:r>
-          </w:p>
-        </w:tc>
-        <w:tc>
-          <w:tcPr>
-            <w:tcW w:type="dxa" w:w="850"/>
-            <w:tcBorders>
-              <w:top w:val="single" w:color="BFBFBF" w:sz="4"/>
-              <w:left w:val="single" w:color="BFBFBF" w:sz="4"/>
-              <w:bottom w:val="single" w:color="BFBFBF" w:sz="4"/>
-              <w:right w:val="single" w:color="BFBFBF" w:sz="4"/>
-            </w:tcBorders>
-            <w:shd w:fill="F6F0F8" w:color="auto" w:val="clear"/>
-            <w:tcMar>
-              <w:top w:type="dxa" w:w="60"/>
-              <w:left w:type="dxa" w:w="100"/>
-              <w:bottom w:type="dxa" w:w="60"/>
-              <w:right w:type="dxa" w:w="100"/>
-            </w:tcMar>
-          </w:tcPr>
-          <w:p>
-            <w:r>
-              <w:rPr>
-                <w:sz w:val="20"/>
-                <w:szCs w:val="20"/>
-              </w:rPr>
-              <w:t xml:space="preserve">1,8</w:t>
-            </w:r>
-          </w:p>
-        </w:tc>
-      </w:tr>
-      <w:tr>
-        <w:tc>
-          <w:tcPr>
-            <w:tcW w:type="dxa" w:w="450"/>
-            <w:tcBorders>
-              <w:top w:val="single" w:color="BFBFBF" w:sz="4"/>
-              <w:left w:val="single" w:color="BFBFBF" w:sz="4"/>
-              <w:bottom w:val="single" w:color="BFBFBF" w:sz="4"/>
-              <w:right w:val="single" w:color="BFBFBF" w:sz="4"/>
-            </w:tcBorders>
-            <w:shd w:fill="FFFFFF" w:color="auto" w:val="clear"/>
-            <w:tcMar>
-              <w:top w:type="dxa" w:w="60"/>
-              <w:left w:type="dxa" w:w="100"/>
-              <w:bottom w:type="dxa" w:w="60"/>
-              <w:right w:type="dxa" w:w="100"/>
-            </w:tcMar>
-          </w:tcPr>
-          <w:p>
-            <w:r>
-              <w:rPr>
-                <w:sz w:val="20"/>
-                <w:szCs w:val="20"/>
-              </w:rPr>
-              <w:t xml:space="preserve">9</w:t>
-            </w:r>
-          </w:p>
-        </w:tc>
-        <w:tc>
-          <w:tcPr>
-            <w:tcW w:type="dxa" w:w="2300"/>
-            <w:tcBorders>
-              <w:top w:val="single" w:color="BFBFBF" w:sz="4"/>
-              <w:left w:val="single" w:color="BFBFBF" w:sz="4"/>
-              <w:bottom w:val="single" w:color="BFBFBF" w:sz="4"/>
-              <w:right w:val="single" w:color="BFBFBF" w:sz="4"/>
-            </w:tcBorders>
-            <w:shd w:fill="FFFFFF" w:color="auto" w:val="clear"/>
-            <w:tcMar>
-              <w:top w:type="dxa" w:w="60"/>
-              <w:left w:type="dxa" w:w="100"/>
-              <w:bottom w:type="dxa" w:w="60"/>
-              <w:right w:type="dxa" w:w="100"/>
-            </w:tcMar>
-          </w:tcPr>
-          <w:p>
-            <w:r>
-              <w:rPr>
-                <w:sz w:val="20"/>
-                <w:szCs w:val="20"/>
-              </w:rPr>
-              <w:t xml:space="preserve">Mechas sábado às 15h</w:t>
-            </w:r>
-          </w:p>
-        </w:tc>
-        <w:tc>
-          <w:tcPr>
-            <w:tcW w:type="dxa" w:w="2050"/>
-            <w:tcBorders>
-              <w:top w:val="single" w:color="BFBFBF" w:sz="4"/>
-              <w:left w:val="single" w:color="BFBFBF" w:sz="4"/>
-              <w:bottom w:val="single" w:color="BFBFBF" w:sz="4"/>
-              <w:right w:val="single" w:color="BFBFBF" w:sz="4"/>
-            </w:tcBorders>
-            <w:shd w:fill="FFFFFF" w:color="auto" w:val="clear"/>
-            <w:tcMar>
-              <w:top w:type="dxa" w:w="60"/>
-              <w:left w:type="dxa" w:w="100"/>
-              <w:bottom w:type="dxa" w:w="60"/>
-              <w:right w:type="dxa" w:w="100"/>
-            </w:tcMar>
-          </w:tcPr>
-          <w:p>
-            <w:r>
-              <w:rPr>
-                <w:sz w:val="20"/>
-                <w:szCs w:val="20"/>
-              </w:rPr>
-              <w:t xml:space="preserve">Não cabe (fecha 17h), oferece outro</w:t>
-            </w:r>
-          </w:p>
-        </w:tc>
-        <w:tc>
-          <w:tcPr>
-            <w:tcW w:type="dxa" w:w="3376"/>
-            <w:tcBorders>
-              <w:top w:val="single" w:color="BFBFBF" w:sz="4"/>
-              <w:left w:val="single" w:color="BFBFBF" w:sz="4"/>
-              <w:bottom w:val="single" w:color="BFBFBF" w:sz="4"/>
-              <w:right w:val="single" w:color="BFBFBF" w:sz="4"/>
-            </w:tcBorders>
-            <w:shd w:fill="FFFFFF" w:color="auto" w:val="clear"/>
-            <w:tcMar>
-              <w:top w:type="dxa" w:w="60"/>
-              <w:left w:type="dxa" w:w="100"/>
-              <w:bottom w:type="dxa" w:w="60"/>
-              <w:right w:type="dxa" w:w="100"/>
-            </w:tcMar>
-          </w:tcPr>
-          <w:p>
-            <w:r>
-              <w:rPr>
-                <w:sz w:val="20"/>
-                <w:szCs w:val="20"/>
-              </w:rPr>
-              <w:t xml:space="preserve">Certo: agendou das 14h às 17h. Falha: uma alternativa se sobrepunha</w:t>
-            </w:r>
-          </w:p>
-        </w:tc>
-        <w:tc>
-          <w:tcPr>
-            <w:tcW w:type="dxa" w:w="850"/>
-            <w:tcBorders>
-              <w:top w:val="single" w:color="BFBFBF" w:sz="4"/>
-              <w:left w:val="single" w:color="BFBFBF" w:sz="4"/>
-              <w:bottom w:val="single" w:color="BFBFBF" w:sz="4"/>
-              <w:right w:val="single" w:color="BFBFBF" w:sz="4"/>
-            </w:tcBorders>
-            <w:shd w:fill="FFFFFF" w:color="auto" w:val="clear"/>
-            <w:tcMar>
-              <w:top w:type="dxa" w:w="60"/>
-              <w:left w:type="dxa" w:w="100"/>
-              <w:bottom w:type="dxa" w:w="60"/>
-              <w:right w:type="dxa" w:w="100"/>
-            </w:tcMar>
-          </w:tcPr>
-          <w:p>
-            <w:r>
-              <w:rPr>
-                <w:sz w:val="20"/>
-                <w:szCs w:val="20"/>
-              </w:rPr>
-              <w:t xml:space="preserve">4,7</w:t>
-            </w:r>
-          </w:p>
-        </w:tc>
-      </w:tr>
-      <w:tr>
-        <w:tc>
-          <w:tcPr>
-            <w:tcW w:type="dxa" w:w="450"/>
-            <w:tcBorders>
-              <w:top w:val="single" w:color="BFBFBF" w:sz="4"/>
-              <w:left w:val="single" w:color="BFBFBF" w:sz="4"/>
-              <w:bottom w:val="single" w:color="BFBFBF" w:sz="4"/>
-              <w:right w:val="single" w:color="BFBFBF" w:sz="4"/>
-            </w:tcBorders>
-            <w:shd w:fill="F6F0F8" w:color="auto" w:val="clear"/>
-            <w:tcMar>
-              <w:top w:type="dxa" w:w="60"/>
-              <w:left w:type="dxa" w:w="100"/>
-              <w:bottom w:type="dxa" w:w="60"/>
-              <w:right w:type="dxa" w:w="100"/>
-            </w:tcMar>
-          </w:tcPr>
-          <w:p>
-            <w:r>
-              <w:rPr>
-                <w:sz w:val="20"/>
-                <w:szCs w:val="20"/>
-              </w:rPr>
-              <w:t xml:space="preserve">10</w:t>
-            </w:r>
-          </w:p>
-        </w:tc>
-        <w:tc>
-          <w:tcPr>
-            <w:tcW w:type="dxa" w:w="2300"/>
-            <w:tcBorders>
-              <w:top w:val="single" w:color="BFBFBF" w:sz="4"/>
-              <w:left w:val="single" w:color="BFBFBF" w:sz="4"/>
-              <w:bottom w:val="single" w:color="BFBFBF" w:sz="4"/>
-              <w:right w:val="single" w:color="BFBFBF" w:sz="4"/>
-            </w:tcBorders>
-            <w:shd w:fill="F6F0F8" w:color="auto" w:val="clear"/>
-            <w:tcMar>
-              <w:top w:type="dxa" w:w="60"/>
-              <w:left w:type="dxa" w:w="100"/>
-              <w:bottom w:type="dxa" w:w="60"/>
-              <w:right w:type="dxa" w:w="100"/>
-            </w:tcMar>
-          </w:tcPr>
-          <w:p>
-            <w:r>
-              <w:rPr>
-                <w:sz w:val="20"/>
-                <w:szCs w:val="20"/>
-              </w:rPr>
-              <w:t xml:space="preserve">Confirma o agendamento</w:t>
-            </w:r>
-          </w:p>
-        </w:tc>
-        <w:tc>
-          <w:tcPr>
-            <w:tcW w:type="dxa" w:w="2050"/>
-            <w:tcBorders>
-              <w:top w:val="single" w:color="BFBFBF" w:sz="4"/>
-              <w:left w:val="single" w:color="BFBFBF" w:sz="4"/>
-              <w:bottom w:val="single" w:color="BFBFBF" w:sz="4"/>
-              <w:right w:val="single" w:color="BFBFBF" w:sz="4"/>
-            </w:tcBorders>
-            <w:shd w:fill="F6F0F8" w:color="auto" w:val="clear"/>
-            <w:tcMar>
-              <w:top w:type="dxa" w:w="60"/>
-              <w:left w:type="dxa" w:w="100"/>
-              <w:bottom w:type="dxa" w:w="60"/>
-              <w:right w:type="dxa" w:w="100"/>
-            </w:tcMar>
-          </w:tcPr>
-          <w:p>
-            <w:r>
-              <w:rPr>
-                <w:sz w:val="20"/>
-                <w:szCs w:val="20"/>
-              </w:rPr>
-              <w:t xml:space="preserve">Evento com duração certa</w:t>
-            </w:r>
-          </w:p>
-        </w:tc>
-        <w:tc>
-          <w:tcPr>
-            <w:tcW w:type="dxa" w:w="3376"/>
-            <w:tcBorders>
-              <w:top w:val="single" w:color="BFBFBF" w:sz="4"/>
-              <w:left w:val="single" w:color="BFBFBF" w:sz="4"/>
-              <w:bottom w:val="single" w:color="BFBFBF" w:sz="4"/>
-              <w:right w:val="single" w:color="BFBFBF" w:sz="4"/>
-            </w:tcBorders>
-            <w:shd w:fill="F6F0F8" w:color="auto" w:val="clear"/>
-            <w:tcMar>
-              <w:top w:type="dxa" w:w="60"/>
-              <w:left w:type="dxa" w:w="100"/>
-              <w:bottom w:type="dxa" w:w="60"/>
-              <w:right w:type="dxa" w:w="100"/>
-            </w:tcMar>
-          </w:tcPr>
-          <w:p>
-            <w:r>
-              <w:rPr>
-                <w:sz w:val="20"/>
-                <w:szCs w:val="20"/>
-              </w:rPr>
-              <w:t xml:space="preserve">Certo: criou o evento na agenda com o cliente como convidado</w:t>
-            </w:r>
-          </w:p>
-        </w:tc>
-        <w:tc>
-          <w:tcPr>
-            <w:tcW w:type="dxa" w:w="850"/>
-            <w:tcBorders>
-              <w:top w:val="single" w:color="BFBFBF" w:sz="4"/>
-              <w:left w:val="single" w:color="BFBFBF" w:sz="4"/>
-              <w:bottom w:val="single" w:color="BFBFBF" w:sz="4"/>
-              <w:right w:val="single" w:color="BFBFBF" w:sz="4"/>
-            </w:tcBorders>
-            <w:shd w:fill="F6F0F8" w:color="auto" w:val="clear"/>
-            <w:tcMar>
-              <w:top w:type="dxa" w:w="60"/>
-              <w:left w:type="dxa" w:w="100"/>
-              <w:bottom w:type="dxa" w:w="60"/>
-              <w:right w:type="dxa" w:w="100"/>
-            </w:tcMar>
-          </w:tcPr>
-          <w:p>
-            <w:r>
-              <w:rPr>
-                <w:sz w:val="20"/>
-                <w:szCs w:val="20"/>
-              </w:rPr>
-              <w:t xml:space="preserve">3,9</w:t>
-            </w:r>
-          </w:p>
-        </w:tc>
-      </w:tr>
-    </w:tbl>
-    <w:p>
-      <w:pPr>
-        <w:spacing w:after="120"/>
-      </w:pPr>
-    </w:p>
-    <w:p>
-      <w:pPr>
-        <w:spacing w:after="140" w:line="330"/>
-        <w:jc w:val="both"/>
-      </w:pPr>
-      <w:r>
-        <w:rPr>
-          <w:b/>
-          <w:bCs/>
-        </w:rPr>
-        <w:t xml:space="preserve">Resultado:</w:t>
-      </w:r>
-      <w:r>
-        <w:t xml:space="preserve"> 10 de 10 (100%) no comportamento esperado de cada teste. No teste 9, uma das três alternativas oferecidas tinha sobreposição de horário, o que levou ao segundo ajuste do prompt (seção 6.5).</w:t>
-      </w:r>
-    </w:p>
-    <w:p>
-      <w:pPr>
-        <w:spacing w:after="140" w:line="330"/>
-        <w:jc w:val="both"/>
-      </w:pPr>
-      <w:r>
-        <w:rPr>
-          <w:b/>
-          <w:bCs/>
-        </w:rPr>
-        <w:t xml:space="preserve">Tempo de execução:</w:t>
-      </w:r>
-      <w:r>
-        <w:t xml:space="preserve"> média de 3,1 segundos por resposta, variando de 1,1 s (pergunta simples, sem ferramenta) a 8,0 s (consulta à agenda e duas decisões na mesma resposta). Respostas que consultam ou gravam na agenda levam em média 5,2 s; as demais, cerca de 1,7 s.</w:t>
-      </w:r>
-    </w:p>
-    <w:p>
-      <w:pPr>
-        <w:spacing w:after="80"/>
-        <w:jc w:val="both"/>
-      </w:pPr>
-      <w:r>
-        <w:rPr>
-          <w:b/>
-          <w:bCs/>
-        </w:rPr>
-        <w:t xml:space="preserve">Segurança dos dados:</w:t>
-      </w:r>
-    </w:p>
-    <w:p>
-      <w:pPr>
-        <w:pStyle w:val="ListParagraph"/>
-        <w:numPr>
-          <w:ilvl w:val="0"/>
-          <w:numId w:val="4"/>
-        </w:numPr>
-        <w:spacing w:after="80" w:line="310"/>
-      </w:pPr>
-      <w:r>
-        <w:t xml:space="preserve">Chaves de API guardadas no gerenciador de credenciais do n8n, fora do código.</w:t>
-      </w:r>
-    </w:p>
-    <w:p>
-      <w:pPr>
-        <w:pStyle w:val="ListParagraph"/>
-        <w:numPr>
-          <w:ilvl w:val="0"/>
-          <w:numId w:val="4"/>
-        </w:numPr>
-        <w:spacing w:after="80" w:line="310"/>
-      </w:pPr>
-      <w:r>
-        <w:t xml:space="preserve">Ferramentas com poder limitado: o agente só consegue ler e criar eventos na agenda do negócio; não consegue apagar nem acessar outros dados.</w:t>
-      </w:r>
-    </w:p>
-    <w:p>
-      <w:pPr>
-        <w:pStyle w:val="ListParagraph"/>
-        <w:numPr>
-          <w:ilvl w:val="0"/>
-          <w:numId w:val="4"/>
-        </w:numPr>
-        <w:spacing w:after="80" w:line="310"/>
-      </w:pPr>
-      <w:r>
-        <w:t xml:space="preserve">Privacidade: o agente não revela agendamentos de outros clientes.</w:t>
-      </w:r>
-    </w:p>
-    <w:p>
-      <w:pPr>
-        <w:pStyle w:val="ListParagraph"/>
-        <w:numPr>
-          <w:ilvl w:val="0"/>
-          <w:numId w:val="4"/>
-        </w:numPr>
-        <w:spacing w:after="80" w:line="310"/>
-      </w:pPr>
-      <w:r>
-        <w:t xml:space="preserve">O agente só pede nome e e-mail, o mínimo para agendar (princípio da necessidade da LGPD).</w:t>
-      </w:r>
-    </w:p>
-    <w:p>
-      <w:pPr>
-        <w:pStyle w:val="ListParagraph"/>
-        <w:numPr>
-          <w:ilvl w:val="0"/>
-          <w:numId w:val="4"/>
-        </w:numPr>
-        <w:spacing w:after="80" w:line="310"/>
-      </w:pPr>
-      <w:r>
-        <w:t xml:space="preserve">Testes feitos apenas com dados fictícios e um e-mail criado para testes.</w:t>
-      </w:r>
-    </w:p>
-    <w:p>
-      <w:pPr>
-        <w:pStyle w:val="Heading2"/>
-      </w:pPr>
-      <w:r>
-        <w:t xml:space="preserve">Exemplo de conversa</w:t>
+        <w:t xml:space="preserve">Evolution API</w:t>
+      </w:r>
+      <w:r>
+        <w:t xml:space="preserve">, uma ferramenta open-source que conecta um número ao n8n pelo WhatsApp Web. A Evolution roda no computador do aluno com Docker, e o número é conectado lendo um QR Code, como no WhatsApp Web.</w:t>
       </w:r>
     </w:p>
     <w:p>
@@ -5710,7 +4064,7 @@
       <w:r>
         <w:drawing>
           <wp:inline distT="0" distB="0" distL="0" distR="0">
-            <wp:extent cx="4095750" cy="4057650"/>
+            <wp:extent cx="5715000" cy="2143125"/>
             <wp:effectExtent t="0" r="0" b="0" l="0"/>
             <wp:docPr id="4" name=""/>
             <wp:cNvGraphicFramePr>
@@ -5735,7 +4089,7 @@
                   <pic:spPr bwMode="auto">
                     <a:xfrm>
                       <a:off x="0" y="0"/>
-                      <a:ext cx="4095750" cy="4057650"/>
+                      <a:ext cx="5715000" cy="2143125"/>
                     </a:xfrm>
                     <a:prstGeom prst="rect">
                       <a:avLst/>
@@ -5750,13 +4104,1866 @@
     </w:p>
     <w:p>
       <w:pPr>
+        <w:spacing w:after="240"/>
+        <w:jc w:val="center"/>
+      </w:pPr>
+      <w:r>
+        <w:rPr>
+          <w:i/>
+          <w:iCs/>
+          <w:color w:val="555555"/>
+          <w:sz w:val="20"/>
+          <w:szCs w:val="20"/>
+        </w:rPr>
+        <w:t xml:space="preserve">Figura 4 – Caminho de uma mensagem do WhatsApp até o agente e de volta ao cliente</w:t>
+      </w:r>
+    </w:p>
+    <w:p>
+      <w:pPr>
+        <w:spacing w:after="80"/>
+        <w:jc w:val="both"/>
+      </w:pPr>
+      <w:r>
+        <w:rPr>
+          <w:b/>
+          <w:bCs/>
+        </w:rPr>
+        <w:t xml:space="preserve">Como funciona:</w:t>
+      </w:r>
+    </w:p>
+    <w:p>
+      <w:pPr>
+        <w:pStyle w:val="ListParagraph"/>
+        <w:numPr>
+          <w:ilvl w:val="0"/>
+          <w:numId w:val="6"/>
+        </w:numPr>
+        <w:spacing w:after="80" w:line="310"/>
+      </w:pPr>
+      <w:r>
+        <w:rPr>
+          <w:b/>
+          <w:bCs/>
+        </w:rPr>
+        <w:t xml:space="preserve">Webhook:</w:t>
+      </w:r>
+      <w:r>
+        <w:t xml:space="preserve"> quando chega uma mensagem, a Evolution envia os dados para um endereço do n8n (gatilho Webhook).</w:t>
+      </w:r>
+    </w:p>
+    <w:p>
+      <w:pPr>
+        <w:pStyle w:val="ListParagraph"/>
+        <w:numPr>
+          <w:ilvl w:val="0"/>
+          <w:numId w:val="6"/>
+        </w:numPr>
+        <w:spacing w:after="80" w:line="310"/>
+      </w:pPr>
+      <w:r>
+        <w:rPr>
+          <w:b/>
+          <w:bCs/>
+        </w:rPr>
+        <w:t xml:space="preserve">Leitura:</w:t>
+      </w:r>
+      <w:r>
+        <w:t xml:space="preserve"> um nó separa o texto e o número de quem escreveu. O número vira a chave da memória, então cada cliente tem a sua conversa.</w:t>
+      </w:r>
+    </w:p>
+    <w:p>
+      <w:pPr>
+        <w:pStyle w:val="ListParagraph"/>
+        <w:numPr>
+          <w:ilvl w:val="0"/>
+          <w:numId w:val="6"/>
+        </w:numPr>
+        <w:spacing w:after="80" w:line="310"/>
+      </w:pPr>
+      <w:r>
+        <w:rPr>
+          <w:b/>
+          <w:bCs/>
+        </w:rPr>
+        <w:t xml:space="preserve">Filtro:</w:t>
+      </w:r>
+      <w:r>
+        <w:t xml:space="preserve"> durante os testes, o agente só responde a um número de teste, para não atender os contatos pessoais do número conectado.</w:t>
+      </w:r>
+    </w:p>
+    <w:p>
+      <w:pPr>
+        <w:pStyle w:val="ListParagraph"/>
+        <w:numPr>
+          <w:ilvl w:val="0"/>
+          <w:numId w:val="6"/>
+        </w:numPr>
+        <w:spacing w:after="80" w:line="310"/>
+      </w:pPr>
+      <w:r>
+        <w:rPr>
+          <w:b/>
+          <w:bCs/>
+        </w:rPr>
+        <w:t xml:space="preserve">Agente:</w:t>
+      </w:r>
+      <w:r>
+        <w:t xml:space="preserve"> o mesmo AI Agent do chat, com o mesmo prompt, base de conhecimento e ferramentas de agenda.</w:t>
+      </w:r>
+    </w:p>
+    <w:p>
+      <w:pPr>
+        <w:pStyle w:val="ListParagraph"/>
+        <w:numPr>
+          <w:ilvl w:val="0"/>
+          <w:numId w:val="6"/>
+        </w:numPr>
+        <w:spacing w:after="80" w:line="310"/>
+      </w:pPr>
+      <w:r>
+        <w:rPr>
+          <w:b/>
+          <w:bCs/>
+        </w:rPr>
+        <w:t xml:space="preserve">Resposta:</w:t>
+      </w:r>
+      <w:r>
+        <w:t xml:space="preserve"> um nó HTTP Request chama a Evolution para enviar a resposta. Como o n8n está na nuvem e a Evolution no computador, um túnel da Cloudflare cria um endereço público para essa chamada.</w:t>
+      </w:r>
+    </w:p>
+    <w:p>
+      <w:pPr>
+        <w:spacing w:after="140" w:line="330"/>
+        <w:jc w:val="both"/>
+      </w:pPr>
+      <w:r>
+        <w:rPr>
+          <w:b/>
+          <w:bCs/>
+        </w:rPr>
+        <w:t xml:space="preserve">Resultado:</w:t>
+      </w:r>
+      <w:r>
+        <w:t xml:space="preserve"> em uma conversa de 11 mensagens pelo WhatsApp, o agente respondeu todas, em cerca de 3 segundos cada, incluindo o envio. Ele indicou a pedicure com a Patrícia, ofereceu horários livres, pediu o e-mail, confirmou o resumo e criou o evento no Google Agenda. Também recusou uma pergunta fora do escopo (programação) e avisou que não oferece um serviço que não está na base.</w:t>
+      </w:r>
+    </w:p>
+    <w:p>
+      <w:pPr>
+        <w:spacing w:after="140" w:line="330"/>
+        <w:jc w:val="both"/>
+      </w:pPr>
+      <w:r>
+        <w:rPr>
+          <w:b/>
+          <w:bCs/>
+        </w:rPr>
+        <w:t xml:space="preserve">Cuidados:</w:t>
+      </w:r>
+      <w:r>
+        <w:t xml:space="preserve"> a Evolution exige uma chave (apikey), guardada no gerenciador de credenciais do n8n. Como ela usa o WhatsApp Web e não a API oficial da Meta, existe risco de bloqueio do número, por isso foi usado um número de teste e poucas mensagens. Para um salão de verdade, o caminho é a API oficial do WhatsApp Business ou a Evolution em um servidor com endereço fixo.</w:t>
+      </w:r>
+    </w:p>
+    <w:p>
+      <w:pPr>
+        <w:pStyle w:val="Heading1"/>
+      </w:pPr>
+      <w:r>
+        <w:t xml:space="preserve">7. Camada de avaliação</w:t>
+      </w:r>
+    </w:p>
+    <w:p>
+      <w:pPr>
+        <w:spacing w:after="140" w:line="330"/>
+        <w:jc w:val="both"/>
+      </w:pPr>
+      <w:r>
+        <w:rPr>
+          <w:b/>
+          <w:bCs/>
+        </w:rPr>
+        <w:t xml:space="preserve">Taxa de acerto:</w:t>
+      </w:r>
+      <w:r>
+        <w:t xml:space="preserve"> cada caso foi testado em uma conversa nova e marcado como certo ou errado. O tempo foi medido no histórico de execuções do n8n.</w:t>
+      </w:r>
+    </w:p>
+    <w:tbl>
+      <w:tblPr>
+        <w:tblW w:type="dxa" w:w="9026"/>
+        <w:tblBorders>
+          <w:top w:val="single" w:color="auto" w:sz="4"/>
+          <w:left w:val="single" w:color="auto" w:sz="4"/>
+          <w:bottom w:val="single" w:color="auto" w:sz="4"/>
+          <w:right w:val="single" w:color="auto" w:sz="4"/>
+          <w:insideH w:val="single" w:color="auto" w:sz="4"/>
+          <w:insideV w:val="single" w:color="auto" w:sz="4"/>
+        </w:tblBorders>
+      </w:tblPr>
+      <w:tblGrid>
+        <w:gridCol w:w="450"/>
+        <w:gridCol w:w="2300"/>
+        <w:gridCol w:w="2050"/>
+        <w:gridCol w:w="3376"/>
+        <w:gridCol w:w="850"/>
+      </w:tblGrid>
+      <w:tr>
+        <w:trPr>
+          <w:tblHeader/>
+        </w:trPr>
+        <w:tc>
+          <w:tcPr>
+            <w:tcW w:type="dxa" w:w="450"/>
+            <w:tcBorders>
+              <w:top w:val="single" w:color="BFBFBF" w:sz="4"/>
+              <w:left w:val="single" w:color="BFBFBF" w:sz="4"/>
+              <w:bottom w:val="single" w:color="BFBFBF" w:sz="4"/>
+              <w:right w:val="single" w:color="BFBFBF" w:sz="4"/>
+            </w:tcBorders>
+            <w:shd w:fill="4A1D5C" w:color="auto" w:val="clear"/>
+            <w:tcMar>
+              <w:top w:type="dxa" w:w="80"/>
+              <w:left w:type="dxa" w:w="100"/>
+              <w:bottom w:type="dxa" w:w="80"/>
+              <w:right w:type="dxa" w:w="100"/>
+            </w:tcMar>
+          </w:tcPr>
+          <w:p>
+            <w:r>
+              <w:rPr>
+                <w:b/>
+                <w:bCs/>
+                <w:color w:val="FFFFFF"/>
+                <w:sz w:val="20"/>
+                <w:szCs w:val="20"/>
+              </w:rPr>
+              <w:t xml:space="preserve">#</w:t>
+            </w:r>
+          </w:p>
+        </w:tc>
+        <w:tc>
+          <w:tcPr>
+            <w:tcW w:type="dxa" w:w="2300"/>
+            <w:tcBorders>
+              <w:top w:val="single" w:color="BFBFBF" w:sz="4"/>
+              <w:left w:val="single" w:color="BFBFBF" w:sz="4"/>
+              <w:bottom w:val="single" w:color="BFBFBF" w:sz="4"/>
+              <w:right w:val="single" w:color="BFBFBF" w:sz="4"/>
+            </w:tcBorders>
+            <w:shd w:fill="4A1D5C" w:color="auto" w:val="clear"/>
+            <w:tcMar>
+              <w:top w:type="dxa" w:w="80"/>
+              <w:left w:type="dxa" w:w="100"/>
+              <w:bottom w:type="dxa" w:w="80"/>
+              <w:right w:type="dxa" w:w="100"/>
+            </w:tcMar>
+          </w:tcPr>
+          <w:p>
+            <w:r>
+              <w:rPr>
+                <w:b/>
+                <w:bCs/>
+                <w:color w:val="FFFFFF"/>
+                <w:sz w:val="20"/>
+                <w:szCs w:val="20"/>
+              </w:rPr>
+              <w:t xml:space="preserve">Mensagem do cliente</w:t>
+            </w:r>
+          </w:p>
+        </w:tc>
+        <w:tc>
+          <w:tcPr>
+            <w:tcW w:type="dxa" w:w="2050"/>
+            <w:tcBorders>
+              <w:top w:val="single" w:color="BFBFBF" w:sz="4"/>
+              <w:left w:val="single" w:color="BFBFBF" w:sz="4"/>
+              <w:bottom w:val="single" w:color="BFBFBF" w:sz="4"/>
+              <w:right w:val="single" w:color="BFBFBF" w:sz="4"/>
+            </w:tcBorders>
+            <w:shd w:fill="4A1D5C" w:color="auto" w:val="clear"/>
+            <w:tcMar>
+              <w:top w:type="dxa" w:w="80"/>
+              <w:left w:type="dxa" w:w="100"/>
+              <w:bottom w:type="dxa" w:w="80"/>
+              <w:right w:type="dxa" w:w="100"/>
+            </w:tcMar>
+          </w:tcPr>
+          <w:p>
+            <w:r>
+              <w:rPr>
+                <w:b/>
+                <w:bCs/>
+                <w:color w:val="FFFFFF"/>
+                <w:sz w:val="20"/>
+                <w:szCs w:val="20"/>
+              </w:rPr>
+              <w:t xml:space="preserve">Esperado</w:t>
+            </w:r>
+          </w:p>
+        </w:tc>
+        <w:tc>
+          <w:tcPr>
+            <w:tcW w:type="dxa" w:w="3376"/>
+            <w:tcBorders>
+              <w:top w:val="single" w:color="BFBFBF" w:sz="4"/>
+              <w:left w:val="single" w:color="BFBFBF" w:sz="4"/>
+              <w:bottom w:val="single" w:color="BFBFBF" w:sz="4"/>
+              <w:right w:val="single" w:color="BFBFBF" w:sz="4"/>
+            </w:tcBorders>
+            <w:shd w:fill="4A1D5C" w:color="auto" w:val="clear"/>
+            <w:tcMar>
+              <w:top w:type="dxa" w:w="80"/>
+              <w:left w:type="dxa" w:w="100"/>
+              <w:bottom w:type="dxa" w:w="80"/>
+              <w:right w:type="dxa" w:w="100"/>
+            </w:tcMar>
+          </w:tcPr>
+          <w:p>
+            <w:r>
+              <w:rPr>
+                <w:b/>
+                <w:bCs/>
+                <w:color w:val="FFFFFF"/>
+                <w:sz w:val="20"/>
+                <w:szCs w:val="20"/>
+              </w:rPr>
+              <w:t xml:space="preserve">Resultado</w:t>
+            </w:r>
+          </w:p>
+        </w:tc>
+        <w:tc>
+          <w:tcPr>
+            <w:tcW w:type="dxa" w:w="850"/>
+            <w:tcBorders>
+              <w:top w:val="single" w:color="BFBFBF" w:sz="4"/>
+              <w:left w:val="single" w:color="BFBFBF" w:sz="4"/>
+              <w:bottom w:val="single" w:color="BFBFBF" w:sz="4"/>
+              <w:right w:val="single" w:color="BFBFBF" w:sz="4"/>
+            </w:tcBorders>
+            <w:shd w:fill="4A1D5C" w:color="auto" w:val="clear"/>
+            <w:tcMar>
+              <w:top w:type="dxa" w:w="80"/>
+              <w:left w:type="dxa" w:w="100"/>
+              <w:bottom w:type="dxa" w:w="80"/>
+              <w:right w:type="dxa" w:w="100"/>
+            </w:tcMar>
+          </w:tcPr>
+          <w:p>
+            <w:r>
+              <w:rPr>
+                <w:b/>
+                <w:bCs/>
+                <w:color w:val="FFFFFF"/>
+                <w:sz w:val="20"/>
+                <w:szCs w:val="20"/>
+              </w:rPr>
+              <w:t xml:space="preserve">Tempo (s)</w:t>
+            </w:r>
+          </w:p>
+        </w:tc>
+      </w:tr>
+      <w:tr>
+        <w:tc>
+          <w:tcPr>
+            <w:tcW w:type="dxa" w:w="450"/>
+            <w:tcBorders>
+              <w:top w:val="single" w:color="BFBFBF" w:sz="4"/>
+              <w:left w:val="single" w:color="BFBFBF" w:sz="4"/>
+              <w:bottom w:val="single" w:color="BFBFBF" w:sz="4"/>
+              <w:right w:val="single" w:color="BFBFBF" w:sz="4"/>
+            </w:tcBorders>
+            <w:shd w:fill="FFFFFF" w:color="auto" w:val="clear"/>
+            <w:tcMar>
+              <w:top w:type="dxa" w:w="60"/>
+              <w:left w:type="dxa" w:w="100"/>
+              <w:bottom w:type="dxa" w:w="60"/>
+              <w:right w:type="dxa" w:w="100"/>
+            </w:tcMar>
+          </w:tcPr>
+          <w:p>
+            <w:r>
+              <w:rPr>
+                <w:sz w:val="20"/>
+                <w:szCs w:val="20"/>
+              </w:rPr>
+              <w:t xml:space="preserve">1</w:t>
+            </w:r>
+          </w:p>
+        </w:tc>
+        <w:tc>
+          <w:tcPr>
+            <w:tcW w:type="dxa" w:w="2300"/>
+            <w:tcBorders>
+              <w:top w:val="single" w:color="BFBFBF" w:sz="4"/>
+              <w:left w:val="single" w:color="BFBFBF" w:sz="4"/>
+              <w:bottom w:val="single" w:color="BFBFBF" w:sz="4"/>
+              <w:right w:val="single" w:color="BFBFBF" w:sz="4"/>
+            </w:tcBorders>
+            <w:shd w:fill="FFFFFF" w:color="auto" w:val="clear"/>
+            <w:tcMar>
+              <w:top w:type="dxa" w:w="60"/>
+              <w:left w:type="dxa" w:w="100"/>
+              <w:bottom w:type="dxa" w:w="60"/>
+              <w:right w:type="dxa" w:w="100"/>
+            </w:tcMar>
+          </w:tcPr>
+          <w:p>
+            <w:r>
+              <w:rPr>
+                <w:sz w:val="20"/>
+                <w:szCs w:val="20"/>
+              </w:rPr>
+              <w:t xml:space="preserve">"Quero cobrir meus fios brancos"</w:t>
+            </w:r>
+          </w:p>
+        </w:tc>
+        <w:tc>
+          <w:tcPr>
+            <w:tcW w:type="dxa" w:w="2050"/>
+            <w:tcBorders>
+              <w:top w:val="single" w:color="BFBFBF" w:sz="4"/>
+              <w:left w:val="single" w:color="BFBFBF" w:sz="4"/>
+              <w:bottom w:val="single" w:color="BFBFBF" w:sz="4"/>
+              <w:right w:val="single" w:color="BFBFBF" w:sz="4"/>
+            </w:tcBorders>
+            <w:shd w:fill="FFFFFF" w:color="auto" w:val="clear"/>
+            <w:tcMar>
+              <w:top w:type="dxa" w:w="60"/>
+              <w:left w:type="dxa" w:w="100"/>
+              <w:bottom w:type="dxa" w:w="60"/>
+              <w:right w:type="dxa" w:w="100"/>
+            </w:tcMar>
+          </w:tcPr>
+          <w:p>
+            <w:r>
+              <w:rPr>
+                <w:sz w:val="20"/>
+                <w:szCs w:val="20"/>
+              </w:rPr>
+              <w:t xml:space="preserve">Coloração, Juliana, 2h, R$ 180</w:t>
+            </w:r>
+          </w:p>
+        </w:tc>
+        <w:tc>
+          <w:tcPr>
+            <w:tcW w:type="dxa" w:w="3376"/>
+            <w:tcBorders>
+              <w:top w:val="single" w:color="BFBFBF" w:sz="4"/>
+              <w:left w:val="single" w:color="BFBFBF" w:sz="4"/>
+              <w:bottom w:val="single" w:color="BFBFBF" w:sz="4"/>
+              <w:right w:val="single" w:color="BFBFBF" w:sz="4"/>
+            </w:tcBorders>
+            <w:shd w:fill="FFFFFF" w:color="auto" w:val="clear"/>
+            <w:tcMar>
+              <w:top w:type="dxa" w:w="60"/>
+              <w:left w:type="dxa" w:w="100"/>
+              <w:bottom w:type="dxa" w:w="60"/>
+              <w:right w:type="dxa" w:w="100"/>
+            </w:tcMar>
+          </w:tcPr>
+          <w:p>
+            <w:r>
+              <w:rPr>
+                <w:sz w:val="20"/>
+                <w:szCs w:val="20"/>
+              </w:rPr>
+              <w:t xml:space="preserve">Certo: indicou Coloração com Juliana, 2h, R$ 180 e perguntou se já fez química</w:t>
+            </w:r>
+          </w:p>
+        </w:tc>
+        <w:tc>
+          <w:tcPr>
+            <w:tcW w:type="dxa" w:w="850"/>
+            <w:tcBorders>
+              <w:top w:val="single" w:color="BFBFBF" w:sz="4"/>
+              <w:left w:val="single" w:color="BFBFBF" w:sz="4"/>
+              <w:bottom w:val="single" w:color="BFBFBF" w:sz="4"/>
+              <w:right w:val="single" w:color="BFBFBF" w:sz="4"/>
+            </w:tcBorders>
+            <w:shd w:fill="FFFFFF" w:color="auto" w:val="clear"/>
+            <w:tcMar>
+              <w:top w:type="dxa" w:w="60"/>
+              <w:left w:type="dxa" w:w="100"/>
+              <w:bottom w:type="dxa" w:w="60"/>
+              <w:right w:type="dxa" w:w="100"/>
+            </w:tcMar>
+          </w:tcPr>
+          <w:p>
+            <w:r>
+              <w:rPr>
+                <w:sz w:val="20"/>
+                <w:szCs w:val="20"/>
+              </w:rPr>
+              <w:t xml:space="preserve">2,1</w:t>
+            </w:r>
+          </w:p>
+        </w:tc>
+      </w:tr>
+      <w:tr>
+        <w:tc>
+          <w:tcPr>
+            <w:tcW w:type="dxa" w:w="450"/>
+            <w:tcBorders>
+              <w:top w:val="single" w:color="BFBFBF" w:sz="4"/>
+              <w:left w:val="single" w:color="BFBFBF" w:sz="4"/>
+              <w:bottom w:val="single" w:color="BFBFBF" w:sz="4"/>
+              <w:right w:val="single" w:color="BFBFBF" w:sz="4"/>
+            </w:tcBorders>
+            <w:shd w:fill="F6F0F8" w:color="auto" w:val="clear"/>
+            <w:tcMar>
+              <w:top w:type="dxa" w:w="60"/>
+              <w:left w:type="dxa" w:w="100"/>
+              <w:bottom w:type="dxa" w:w="60"/>
+              <w:right w:type="dxa" w:w="100"/>
+            </w:tcMar>
+          </w:tcPr>
+          <w:p>
+            <w:r>
+              <w:rPr>
+                <w:sz w:val="20"/>
+                <w:szCs w:val="20"/>
+              </w:rPr>
+              <w:t xml:space="preserve">2</w:t>
+            </w:r>
+          </w:p>
+        </w:tc>
+        <w:tc>
+          <w:tcPr>
+            <w:tcW w:type="dxa" w:w="2300"/>
+            <w:tcBorders>
+              <w:top w:val="single" w:color="BFBFBF" w:sz="4"/>
+              <w:left w:val="single" w:color="BFBFBF" w:sz="4"/>
+              <w:bottom w:val="single" w:color="BFBFBF" w:sz="4"/>
+              <w:right w:val="single" w:color="BFBFBF" w:sz="4"/>
+            </w:tcBorders>
+            <w:shd w:fill="F6F0F8" w:color="auto" w:val="clear"/>
+            <w:tcMar>
+              <w:top w:type="dxa" w:w="60"/>
+              <w:left w:type="dxa" w:w="100"/>
+              <w:bottom w:type="dxa" w:w="60"/>
+              <w:right w:type="dxa" w:w="100"/>
+            </w:tcMar>
+          </w:tcPr>
+          <w:p>
+            <w:r>
+              <w:rPr>
+                <w:sz w:val="20"/>
+                <w:szCs w:val="20"/>
+              </w:rPr>
+              <w:t xml:space="preserve">"Meu cabelo está muito ressecado"</w:t>
+            </w:r>
+          </w:p>
+        </w:tc>
+        <w:tc>
+          <w:tcPr>
+            <w:tcW w:type="dxa" w:w="2050"/>
+            <w:tcBorders>
+              <w:top w:val="single" w:color="BFBFBF" w:sz="4"/>
+              <w:left w:val="single" w:color="BFBFBF" w:sz="4"/>
+              <w:bottom w:val="single" w:color="BFBFBF" w:sz="4"/>
+              <w:right w:val="single" w:color="BFBFBF" w:sz="4"/>
+            </w:tcBorders>
+            <w:shd w:fill="F6F0F8" w:color="auto" w:val="clear"/>
+            <w:tcMar>
+              <w:top w:type="dxa" w:w="60"/>
+              <w:left w:type="dxa" w:w="100"/>
+              <w:bottom w:type="dxa" w:w="60"/>
+              <w:right w:type="dxa" w:w="100"/>
+            </w:tcMar>
+          </w:tcPr>
+          <w:p>
+            <w:r>
+              <w:rPr>
+                <w:sz w:val="20"/>
+                <w:szCs w:val="20"/>
+              </w:rPr>
+              <w:t xml:space="preserve">Hidratação com Juliana</w:t>
+            </w:r>
+          </w:p>
+        </w:tc>
+        <w:tc>
+          <w:tcPr>
+            <w:tcW w:type="dxa" w:w="3376"/>
+            <w:tcBorders>
+              <w:top w:val="single" w:color="BFBFBF" w:sz="4"/>
+              <w:left w:val="single" w:color="BFBFBF" w:sz="4"/>
+              <w:bottom w:val="single" w:color="BFBFBF" w:sz="4"/>
+              <w:right w:val="single" w:color="BFBFBF" w:sz="4"/>
+            </w:tcBorders>
+            <w:shd w:fill="F6F0F8" w:color="auto" w:val="clear"/>
+            <w:tcMar>
+              <w:top w:type="dxa" w:w="60"/>
+              <w:left w:type="dxa" w:w="100"/>
+              <w:bottom w:type="dxa" w:w="60"/>
+              <w:right w:type="dxa" w:w="100"/>
+            </w:tcMar>
+          </w:tcPr>
+          <w:p>
+            <w:r>
+              <w:rPr>
+                <w:sz w:val="20"/>
+                <w:szCs w:val="20"/>
+              </w:rPr>
+              <w:t xml:space="preserve">Certo: Hidratação, 45 min, R$ 70; agendou com convite por e-mail</w:t>
+            </w:r>
+          </w:p>
+        </w:tc>
+        <w:tc>
+          <w:tcPr>
+            <w:tcW w:type="dxa" w:w="850"/>
+            <w:tcBorders>
+              <w:top w:val="single" w:color="BFBFBF" w:sz="4"/>
+              <w:left w:val="single" w:color="BFBFBF" w:sz="4"/>
+              <w:bottom w:val="single" w:color="BFBFBF" w:sz="4"/>
+              <w:right w:val="single" w:color="BFBFBF" w:sz="4"/>
+            </w:tcBorders>
+            <w:shd w:fill="F6F0F8" w:color="auto" w:val="clear"/>
+            <w:tcMar>
+              <w:top w:type="dxa" w:w="60"/>
+              <w:left w:type="dxa" w:w="100"/>
+              <w:bottom w:type="dxa" w:w="60"/>
+              <w:right w:type="dxa" w:w="100"/>
+            </w:tcMar>
+          </w:tcPr>
+          <w:p>
+            <w:r>
+              <w:rPr>
+                <w:sz w:val="20"/>
+                <w:szCs w:val="20"/>
+              </w:rPr>
+              <w:t xml:space="preserve">1,5</w:t>
+            </w:r>
+          </w:p>
+        </w:tc>
+      </w:tr>
+      <w:tr>
+        <w:tc>
+          <w:tcPr>
+            <w:tcW w:type="dxa" w:w="450"/>
+            <w:tcBorders>
+              <w:top w:val="single" w:color="BFBFBF" w:sz="4"/>
+              <w:left w:val="single" w:color="BFBFBF" w:sz="4"/>
+              <w:bottom w:val="single" w:color="BFBFBF" w:sz="4"/>
+              <w:right w:val="single" w:color="BFBFBF" w:sz="4"/>
+            </w:tcBorders>
+            <w:shd w:fill="FFFFFF" w:color="auto" w:val="clear"/>
+            <w:tcMar>
+              <w:top w:type="dxa" w:w="60"/>
+              <w:left w:type="dxa" w:w="100"/>
+              <w:bottom w:type="dxa" w:w="60"/>
+              <w:right w:type="dxa" w:w="100"/>
+            </w:tcMar>
+          </w:tcPr>
+          <w:p>
+            <w:r>
+              <w:rPr>
+                <w:sz w:val="20"/>
+                <w:szCs w:val="20"/>
+              </w:rPr>
+              <w:t xml:space="preserve">3</w:t>
+            </w:r>
+          </w:p>
+        </w:tc>
+        <w:tc>
+          <w:tcPr>
+            <w:tcW w:type="dxa" w:w="2300"/>
+            <w:tcBorders>
+              <w:top w:val="single" w:color="BFBFBF" w:sz="4"/>
+              <w:left w:val="single" w:color="BFBFBF" w:sz="4"/>
+              <w:bottom w:val="single" w:color="BFBFBF" w:sz="4"/>
+              <w:right w:val="single" w:color="BFBFBF" w:sz="4"/>
+            </w:tcBorders>
+            <w:shd w:fill="FFFFFF" w:color="auto" w:val="clear"/>
+            <w:tcMar>
+              <w:top w:type="dxa" w:w="60"/>
+              <w:left w:type="dxa" w:w="100"/>
+              <w:bottom w:type="dxa" w:w="60"/>
+              <w:right w:type="dxa" w:w="100"/>
+            </w:tcMar>
+          </w:tcPr>
+          <w:p>
+            <w:r>
+              <w:rPr>
+                <w:sz w:val="20"/>
+                <w:szCs w:val="20"/>
+              </w:rPr>
+              <w:t xml:space="preserve">"Quero fazer as unhas da mão e do pé"</w:t>
+            </w:r>
+          </w:p>
+        </w:tc>
+        <w:tc>
+          <w:tcPr>
+            <w:tcW w:type="dxa" w:w="2050"/>
+            <w:tcBorders>
+              <w:top w:val="single" w:color="BFBFBF" w:sz="4"/>
+              <w:left w:val="single" w:color="BFBFBF" w:sz="4"/>
+              <w:bottom w:val="single" w:color="BFBFBF" w:sz="4"/>
+              <w:right w:val="single" w:color="BFBFBF" w:sz="4"/>
+            </w:tcBorders>
+            <w:shd w:fill="FFFFFF" w:color="auto" w:val="clear"/>
+            <w:tcMar>
+              <w:top w:type="dxa" w:w="60"/>
+              <w:left w:type="dxa" w:w="100"/>
+              <w:bottom w:type="dxa" w:w="60"/>
+              <w:right w:type="dxa" w:w="100"/>
+            </w:tcMar>
+          </w:tcPr>
+          <w:p>
+            <w:r>
+              <w:rPr>
+                <w:sz w:val="20"/>
+                <w:szCs w:val="20"/>
+              </w:rPr>
+              <w:t xml:space="preserve">Mão e pé com Patrícia, 1h30</w:t>
+            </w:r>
+          </w:p>
+        </w:tc>
+        <w:tc>
+          <w:tcPr>
+            <w:tcW w:type="dxa" w:w="3376"/>
+            <w:tcBorders>
+              <w:top w:val="single" w:color="BFBFBF" w:sz="4"/>
+              <w:left w:val="single" w:color="BFBFBF" w:sz="4"/>
+              <w:bottom w:val="single" w:color="BFBFBF" w:sz="4"/>
+              <w:right w:val="single" w:color="BFBFBF" w:sz="4"/>
+            </w:tcBorders>
+            <w:shd w:fill="FFFFFF" w:color="auto" w:val="clear"/>
+            <w:tcMar>
+              <w:top w:type="dxa" w:w="60"/>
+              <w:left w:type="dxa" w:w="100"/>
+              <w:bottom w:type="dxa" w:w="60"/>
+              <w:right w:type="dxa" w:w="100"/>
+            </w:tcMar>
+          </w:tcPr>
+          <w:p>
+            <w:r>
+              <w:rPr>
+                <w:sz w:val="20"/>
+                <w:szCs w:val="20"/>
+              </w:rPr>
+              <w:t xml:space="preserve">Certo: Mão e pé, R$ 65; agendou das 13h às 14h30, respeitando o almoço</w:t>
+            </w:r>
+          </w:p>
+        </w:tc>
+        <w:tc>
+          <w:tcPr>
+            <w:tcW w:type="dxa" w:w="850"/>
+            <w:tcBorders>
+              <w:top w:val="single" w:color="BFBFBF" w:sz="4"/>
+              <w:left w:val="single" w:color="BFBFBF" w:sz="4"/>
+              <w:bottom w:val="single" w:color="BFBFBF" w:sz="4"/>
+              <w:right w:val="single" w:color="BFBFBF" w:sz="4"/>
+            </w:tcBorders>
+            <w:shd w:fill="FFFFFF" w:color="auto" w:val="clear"/>
+            <w:tcMar>
+              <w:top w:type="dxa" w:w="60"/>
+              <w:left w:type="dxa" w:w="100"/>
+              <w:bottom w:type="dxa" w:w="60"/>
+              <w:right w:type="dxa" w:w="100"/>
+            </w:tcMar>
+          </w:tcPr>
+          <w:p>
+            <w:r>
+              <w:rPr>
+                <w:sz w:val="20"/>
+                <w:szCs w:val="20"/>
+              </w:rPr>
+              <w:t xml:space="preserve">4,2</w:t>
+            </w:r>
+          </w:p>
+        </w:tc>
+      </w:tr>
+      <w:tr>
+        <w:tc>
+          <w:tcPr>
+            <w:tcW w:type="dxa" w:w="450"/>
+            <w:tcBorders>
+              <w:top w:val="single" w:color="BFBFBF" w:sz="4"/>
+              <w:left w:val="single" w:color="BFBFBF" w:sz="4"/>
+              <w:bottom w:val="single" w:color="BFBFBF" w:sz="4"/>
+              <w:right w:val="single" w:color="BFBFBF" w:sz="4"/>
+            </w:tcBorders>
+            <w:shd w:fill="F6F0F8" w:color="auto" w:val="clear"/>
+            <w:tcMar>
+              <w:top w:type="dxa" w:w="60"/>
+              <w:left w:type="dxa" w:w="100"/>
+              <w:bottom w:type="dxa" w:w="60"/>
+              <w:right w:type="dxa" w:w="100"/>
+            </w:tcMar>
+          </w:tcPr>
+          <w:p>
+            <w:r>
+              <w:rPr>
+                <w:sz w:val="20"/>
+                <w:szCs w:val="20"/>
+              </w:rPr>
+              <w:t xml:space="preserve">4</w:t>
+            </w:r>
+          </w:p>
+        </w:tc>
+        <w:tc>
+          <w:tcPr>
+            <w:tcW w:type="dxa" w:w="2300"/>
+            <w:tcBorders>
+              <w:top w:val="single" w:color="BFBFBF" w:sz="4"/>
+              <w:left w:val="single" w:color="BFBFBF" w:sz="4"/>
+              <w:bottom w:val="single" w:color="BFBFBF" w:sz="4"/>
+              <w:right w:val="single" w:color="BFBFBF" w:sz="4"/>
+            </w:tcBorders>
+            <w:shd w:fill="F6F0F8" w:color="auto" w:val="clear"/>
+            <w:tcMar>
+              <w:top w:type="dxa" w:w="60"/>
+              <w:left w:type="dxa" w:w="100"/>
+              <w:bottom w:type="dxa" w:w="60"/>
+              <w:right w:type="dxa" w:w="100"/>
+            </w:tcMar>
+          </w:tcPr>
+          <w:p>
+            <w:r>
+              <w:rPr>
+                <w:sz w:val="20"/>
+                <w:szCs w:val="20"/>
+              </w:rPr>
+              <w:t xml:space="preserve">"Quanto custa o corte masculino?"</w:t>
+            </w:r>
+          </w:p>
+        </w:tc>
+        <w:tc>
+          <w:tcPr>
+            <w:tcW w:type="dxa" w:w="2050"/>
+            <w:tcBorders>
+              <w:top w:val="single" w:color="BFBFBF" w:sz="4"/>
+              <w:left w:val="single" w:color="BFBFBF" w:sz="4"/>
+              <w:bottom w:val="single" w:color="BFBFBF" w:sz="4"/>
+              <w:right w:val="single" w:color="BFBFBF" w:sz="4"/>
+            </w:tcBorders>
+            <w:shd w:fill="F6F0F8" w:color="auto" w:val="clear"/>
+            <w:tcMar>
+              <w:top w:type="dxa" w:w="60"/>
+              <w:left w:type="dxa" w:w="100"/>
+              <w:bottom w:type="dxa" w:w="60"/>
+              <w:right w:type="dxa" w:w="100"/>
+            </w:tcMar>
+          </w:tcPr>
+          <w:p>
+            <w:r>
+              <w:rPr>
+                <w:sz w:val="20"/>
+                <w:szCs w:val="20"/>
+              </w:rPr>
+              <w:t xml:space="preserve">R$ 45 (da base)</w:t>
+            </w:r>
+          </w:p>
+        </w:tc>
+        <w:tc>
+          <w:tcPr>
+            <w:tcW w:type="dxa" w:w="3376"/>
+            <w:tcBorders>
+              <w:top w:val="single" w:color="BFBFBF" w:sz="4"/>
+              <w:left w:val="single" w:color="BFBFBF" w:sz="4"/>
+              <w:bottom w:val="single" w:color="BFBFBF" w:sz="4"/>
+              <w:right w:val="single" w:color="BFBFBF" w:sz="4"/>
+            </w:tcBorders>
+            <w:shd w:fill="F6F0F8" w:color="auto" w:val="clear"/>
+            <w:tcMar>
+              <w:top w:type="dxa" w:w="60"/>
+              <w:left w:type="dxa" w:w="100"/>
+              <w:bottom w:type="dxa" w:w="60"/>
+              <w:right w:type="dxa" w:w="100"/>
+            </w:tcMar>
+          </w:tcPr>
+          <w:p>
+            <w:r>
+              <w:rPr>
+                <w:sz w:val="20"/>
+                <w:szCs w:val="20"/>
+              </w:rPr>
+              <w:t xml:space="preserve">Certo: R$ 45, 30 min, com Rafael</w:t>
+            </w:r>
+          </w:p>
+        </w:tc>
+        <w:tc>
+          <w:tcPr>
+            <w:tcW w:type="dxa" w:w="850"/>
+            <w:tcBorders>
+              <w:top w:val="single" w:color="BFBFBF" w:sz="4"/>
+              <w:left w:val="single" w:color="BFBFBF" w:sz="4"/>
+              <w:bottom w:val="single" w:color="BFBFBF" w:sz="4"/>
+              <w:right w:val="single" w:color="BFBFBF" w:sz="4"/>
+            </w:tcBorders>
+            <w:shd w:fill="F6F0F8" w:color="auto" w:val="clear"/>
+            <w:tcMar>
+              <w:top w:type="dxa" w:w="60"/>
+              <w:left w:type="dxa" w:w="100"/>
+              <w:bottom w:type="dxa" w:w="60"/>
+              <w:right w:type="dxa" w:w="100"/>
+            </w:tcMar>
+          </w:tcPr>
+          <w:p>
+            <w:r>
+              <w:rPr>
+                <w:sz w:val="20"/>
+                <w:szCs w:val="20"/>
+              </w:rPr>
+              <w:t xml:space="preserve">1,1</w:t>
+            </w:r>
+          </w:p>
+        </w:tc>
+      </w:tr>
+      <w:tr>
+        <w:tc>
+          <w:tcPr>
+            <w:tcW w:type="dxa" w:w="450"/>
+            <w:tcBorders>
+              <w:top w:val="single" w:color="BFBFBF" w:sz="4"/>
+              <w:left w:val="single" w:color="BFBFBF" w:sz="4"/>
+              <w:bottom w:val="single" w:color="BFBFBF" w:sz="4"/>
+              <w:right w:val="single" w:color="BFBFBF" w:sz="4"/>
+            </w:tcBorders>
+            <w:shd w:fill="FFFFFF" w:color="auto" w:val="clear"/>
+            <w:tcMar>
+              <w:top w:type="dxa" w:w="60"/>
+              <w:left w:type="dxa" w:w="100"/>
+              <w:bottom w:type="dxa" w:w="60"/>
+              <w:right w:type="dxa" w:w="100"/>
+            </w:tcMar>
+          </w:tcPr>
+          <w:p>
+            <w:r>
+              <w:rPr>
+                <w:sz w:val="20"/>
+                <w:szCs w:val="20"/>
+              </w:rPr>
+              <w:t xml:space="preserve">5</w:t>
+            </w:r>
+          </w:p>
+        </w:tc>
+        <w:tc>
+          <w:tcPr>
+            <w:tcW w:type="dxa" w:w="2300"/>
+            <w:tcBorders>
+              <w:top w:val="single" w:color="BFBFBF" w:sz="4"/>
+              <w:left w:val="single" w:color="BFBFBF" w:sz="4"/>
+              <w:bottom w:val="single" w:color="BFBFBF" w:sz="4"/>
+              <w:right w:val="single" w:color="BFBFBF" w:sz="4"/>
+            </w:tcBorders>
+            <w:shd w:fill="FFFFFF" w:color="auto" w:val="clear"/>
+            <w:tcMar>
+              <w:top w:type="dxa" w:w="60"/>
+              <w:left w:type="dxa" w:w="100"/>
+              <w:bottom w:type="dxa" w:w="60"/>
+              <w:right w:type="dxa" w:w="100"/>
+            </w:tcMar>
+          </w:tcPr>
+          <w:p>
+            <w:r>
+              <w:rPr>
+                <w:sz w:val="20"/>
+                <w:szCs w:val="20"/>
+              </w:rPr>
+              <w:t xml:space="preserve">"Vocês abrem segunda?"</w:t>
+            </w:r>
+          </w:p>
+        </w:tc>
+        <w:tc>
+          <w:tcPr>
+            <w:tcW w:type="dxa" w:w="2050"/>
+            <w:tcBorders>
+              <w:top w:val="single" w:color="BFBFBF" w:sz="4"/>
+              <w:left w:val="single" w:color="BFBFBF" w:sz="4"/>
+              <w:bottom w:val="single" w:color="BFBFBF" w:sz="4"/>
+              <w:right w:val="single" w:color="BFBFBF" w:sz="4"/>
+            </w:tcBorders>
+            <w:shd w:fill="FFFFFF" w:color="auto" w:val="clear"/>
+            <w:tcMar>
+              <w:top w:type="dxa" w:w="60"/>
+              <w:left w:type="dxa" w:w="100"/>
+              <w:bottom w:type="dxa" w:w="60"/>
+              <w:right w:type="dxa" w:w="100"/>
+            </w:tcMar>
+          </w:tcPr>
+          <w:p>
+            <w:r>
+              <w:rPr>
+                <w:sz w:val="20"/>
+                <w:szCs w:val="20"/>
+              </w:rPr>
+              <w:t xml:space="preserve">Diz que fecha segunda</w:t>
+            </w:r>
+          </w:p>
+        </w:tc>
+        <w:tc>
+          <w:tcPr>
+            <w:tcW w:type="dxa" w:w="3376"/>
+            <w:tcBorders>
+              <w:top w:val="single" w:color="BFBFBF" w:sz="4"/>
+              <w:left w:val="single" w:color="BFBFBF" w:sz="4"/>
+              <w:bottom w:val="single" w:color="BFBFBF" w:sz="4"/>
+              <w:right w:val="single" w:color="BFBFBF" w:sz="4"/>
+            </w:tcBorders>
+            <w:shd w:fill="FFFFFF" w:color="auto" w:val="clear"/>
+            <w:tcMar>
+              <w:top w:type="dxa" w:w="60"/>
+              <w:left w:type="dxa" w:w="100"/>
+              <w:bottom w:type="dxa" w:w="60"/>
+              <w:right w:type="dxa" w:w="100"/>
+            </w:tcMar>
+          </w:tcPr>
+          <w:p>
+            <w:r>
+              <w:rPr>
+                <w:sz w:val="20"/>
+                <w:szCs w:val="20"/>
+              </w:rPr>
+              <w:t xml:space="preserve">Certo: informou o horário e ofereceu terça</w:t>
+            </w:r>
+          </w:p>
+        </w:tc>
+        <w:tc>
+          <w:tcPr>
+            <w:tcW w:type="dxa" w:w="850"/>
+            <w:tcBorders>
+              <w:top w:val="single" w:color="BFBFBF" w:sz="4"/>
+              <w:left w:val="single" w:color="BFBFBF" w:sz="4"/>
+              <w:bottom w:val="single" w:color="BFBFBF" w:sz="4"/>
+              <w:right w:val="single" w:color="BFBFBF" w:sz="4"/>
+            </w:tcBorders>
+            <w:shd w:fill="FFFFFF" w:color="auto" w:val="clear"/>
+            <w:tcMar>
+              <w:top w:type="dxa" w:w="60"/>
+              <w:left w:type="dxa" w:w="100"/>
+              <w:bottom w:type="dxa" w:w="60"/>
+              <w:right w:type="dxa" w:w="100"/>
+            </w:tcMar>
+          </w:tcPr>
+          <w:p>
+            <w:r>
+              <w:rPr>
+                <w:sz w:val="20"/>
+                <w:szCs w:val="20"/>
+              </w:rPr>
+              <w:t xml:space="preserve">1,4</w:t>
+            </w:r>
+          </w:p>
+        </w:tc>
+      </w:tr>
+      <w:tr>
+        <w:tc>
+          <w:tcPr>
+            <w:tcW w:type="dxa" w:w="450"/>
+            <w:tcBorders>
+              <w:top w:val="single" w:color="BFBFBF" w:sz="4"/>
+              <w:left w:val="single" w:color="BFBFBF" w:sz="4"/>
+              <w:bottom w:val="single" w:color="BFBFBF" w:sz="4"/>
+              <w:right w:val="single" w:color="BFBFBF" w:sz="4"/>
+            </w:tcBorders>
+            <w:shd w:fill="F6F0F8" w:color="auto" w:val="clear"/>
+            <w:tcMar>
+              <w:top w:type="dxa" w:w="60"/>
+              <w:left w:type="dxa" w:w="100"/>
+              <w:bottom w:type="dxa" w:w="60"/>
+              <w:right w:type="dxa" w:w="100"/>
+            </w:tcMar>
+          </w:tcPr>
+          <w:p>
+            <w:r>
+              <w:rPr>
+                <w:sz w:val="20"/>
+                <w:szCs w:val="20"/>
+              </w:rPr>
+              <w:t xml:space="preserve">6</w:t>
+            </w:r>
+          </w:p>
+        </w:tc>
+        <w:tc>
+          <w:tcPr>
+            <w:tcW w:type="dxa" w:w="2300"/>
+            <w:tcBorders>
+              <w:top w:val="single" w:color="BFBFBF" w:sz="4"/>
+              <w:left w:val="single" w:color="BFBFBF" w:sz="4"/>
+              <w:bottom w:val="single" w:color="BFBFBF" w:sz="4"/>
+              <w:right w:val="single" w:color="BFBFBF" w:sz="4"/>
+            </w:tcBorders>
+            <w:shd w:fill="F6F0F8" w:color="auto" w:val="clear"/>
+            <w:tcMar>
+              <w:top w:type="dxa" w:w="60"/>
+              <w:left w:type="dxa" w:w="100"/>
+              <w:bottom w:type="dxa" w:w="60"/>
+              <w:right w:type="dxa" w:w="100"/>
+            </w:tcMar>
+          </w:tcPr>
+          <w:p>
+            <w:r>
+              <w:rPr>
+                <w:sz w:val="20"/>
+                <w:szCs w:val="20"/>
+              </w:rPr>
+              <w:t xml:space="preserve">Primeira vez fazendo mechas</w:t>
+            </w:r>
+          </w:p>
+        </w:tc>
+        <w:tc>
+          <w:tcPr>
+            <w:tcW w:type="dxa" w:w="2050"/>
+            <w:tcBorders>
+              <w:top w:val="single" w:color="BFBFBF" w:sz="4"/>
+              <w:left w:val="single" w:color="BFBFBF" w:sz="4"/>
+              <w:bottom w:val="single" w:color="BFBFBF" w:sz="4"/>
+              <w:right w:val="single" w:color="BFBFBF" w:sz="4"/>
+            </w:tcBorders>
+            <w:shd w:fill="F6F0F8" w:color="auto" w:val="clear"/>
+            <w:tcMar>
+              <w:top w:type="dxa" w:w="60"/>
+              <w:left w:type="dxa" w:w="100"/>
+              <w:bottom w:type="dxa" w:w="60"/>
+              <w:right w:type="dxa" w:w="100"/>
+            </w:tcMar>
+          </w:tcPr>
+          <w:p>
+            <w:r>
+              <w:rPr>
+                <w:sz w:val="20"/>
+                <w:szCs w:val="20"/>
+              </w:rPr>
+              <w:t xml:space="preserve">Oferece teste de alergia 48h antes</w:t>
+            </w:r>
+          </w:p>
+        </w:tc>
+        <w:tc>
+          <w:tcPr>
+            <w:tcW w:type="dxa" w:w="3376"/>
+            <w:tcBorders>
+              <w:top w:val="single" w:color="BFBFBF" w:sz="4"/>
+              <w:left w:val="single" w:color="BFBFBF" w:sz="4"/>
+              <w:bottom w:val="single" w:color="BFBFBF" w:sz="4"/>
+              <w:right w:val="single" w:color="BFBFBF" w:sz="4"/>
+            </w:tcBorders>
+            <w:shd w:fill="F6F0F8" w:color="auto" w:val="clear"/>
+            <w:tcMar>
+              <w:top w:type="dxa" w:w="60"/>
+              <w:left w:type="dxa" w:w="100"/>
+              <w:bottom w:type="dxa" w:w="60"/>
+              <w:right w:type="dxa" w:w="100"/>
+            </w:tcMar>
+          </w:tcPr>
+          <w:p>
+            <w:r>
+              <w:rPr>
+                <w:sz w:val="20"/>
+                <w:szCs w:val="20"/>
+              </w:rPr>
+              <w:t xml:space="preserve">Certo: teste na sexta e mechas na terça; recusou horário já ocupado</w:t>
+            </w:r>
+          </w:p>
+        </w:tc>
+        <w:tc>
+          <w:tcPr>
+            <w:tcW w:type="dxa" w:w="850"/>
+            <w:tcBorders>
+              <w:top w:val="single" w:color="BFBFBF" w:sz="4"/>
+              <w:left w:val="single" w:color="BFBFBF" w:sz="4"/>
+              <w:bottom w:val="single" w:color="BFBFBF" w:sz="4"/>
+              <w:right w:val="single" w:color="BFBFBF" w:sz="4"/>
+            </w:tcBorders>
+            <w:shd w:fill="F6F0F8" w:color="auto" w:val="clear"/>
+            <w:tcMar>
+              <w:top w:type="dxa" w:w="60"/>
+              <w:left w:type="dxa" w:w="100"/>
+              <w:bottom w:type="dxa" w:w="60"/>
+              <w:right w:type="dxa" w:w="100"/>
+            </w:tcMar>
+          </w:tcPr>
+          <w:p>
+            <w:r>
+              <w:rPr>
+                <w:sz w:val="20"/>
+                <w:szCs w:val="20"/>
+              </w:rPr>
+              <w:t xml:space="preserve">8,0</w:t>
+            </w:r>
+          </w:p>
+        </w:tc>
+      </w:tr>
+      <w:tr>
+        <w:tc>
+          <w:tcPr>
+            <w:tcW w:type="dxa" w:w="450"/>
+            <w:tcBorders>
+              <w:top w:val="single" w:color="BFBFBF" w:sz="4"/>
+              <w:left w:val="single" w:color="BFBFBF" w:sz="4"/>
+              <w:bottom w:val="single" w:color="BFBFBF" w:sz="4"/>
+              <w:right w:val="single" w:color="BFBFBF" w:sz="4"/>
+            </w:tcBorders>
+            <w:shd w:fill="FFFFFF" w:color="auto" w:val="clear"/>
+            <w:tcMar>
+              <w:top w:type="dxa" w:w="60"/>
+              <w:left w:type="dxa" w:w="100"/>
+              <w:bottom w:type="dxa" w:w="60"/>
+              <w:right w:type="dxa" w:w="100"/>
+            </w:tcMar>
+          </w:tcPr>
+          <w:p>
+            <w:r>
+              <w:rPr>
+                <w:sz w:val="20"/>
+                <w:szCs w:val="20"/>
+              </w:rPr>
+              <w:t xml:space="preserve">7</w:t>
+            </w:r>
+          </w:p>
+        </w:tc>
+        <w:tc>
+          <w:tcPr>
+            <w:tcW w:type="dxa" w:w="2300"/>
+            <w:tcBorders>
+              <w:top w:val="single" w:color="BFBFBF" w:sz="4"/>
+              <w:left w:val="single" w:color="BFBFBF" w:sz="4"/>
+              <w:bottom w:val="single" w:color="BFBFBF" w:sz="4"/>
+              <w:right w:val="single" w:color="BFBFBF" w:sz="4"/>
+            </w:tcBorders>
+            <w:shd w:fill="FFFFFF" w:color="auto" w:val="clear"/>
+            <w:tcMar>
+              <w:top w:type="dxa" w:w="60"/>
+              <w:left w:type="dxa" w:w="100"/>
+              <w:bottom w:type="dxa" w:w="60"/>
+              <w:right w:type="dxa" w:w="100"/>
+            </w:tcMar>
+          </w:tcPr>
+          <w:p>
+            <w:r>
+              <w:rPr>
+                <w:sz w:val="20"/>
+                <w:szCs w:val="20"/>
+              </w:rPr>
+              <w:t xml:space="preserve">Quer coloração e diz "Já tive alergia"</w:t>
+            </w:r>
+          </w:p>
+        </w:tc>
+        <w:tc>
+          <w:tcPr>
+            <w:tcW w:type="dxa" w:w="2050"/>
+            <w:tcBorders>
+              <w:top w:val="single" w:color="BFBFBF" w:sz="4"/>
+              <w:left w:val="single" w:color="BFBFBF" w:sz="4"/>
+              <w:bottom w:val="single" w:color="BFBFBF" w:sz="4"/>
+              <w:right w:val="single" w:color="BFBFBF" w:sz="4"/>
+            </w:tcBorders>
+            <w:shd w:fill="FFFFFF" w:color="auto" w:val="clear"/>
+            <w:tcMar>
+              <w:top w:type="dxa" w:w="60"/>
+              <w:left w:type="dxa" w:w="100"/>
+              <w:bottom w:type="dxa" w:w="60"/>
+              <w:right w:type="dxa" w:w="100"/>
+            </w:tcMar>
+          </w:tcPr>
+          <w:p>
+            <w:r>
+              <w:rPr>
+                <w:sz w:val="20"/>
+                <w:szCs w:val="20"/>
+              </w:rPr>
+              <w:t xml:space="preserve">Não agenda química, orienta dermatologista</w:t>
+            </w:r>
+          </w:p>
+        </w:tc>
+        <w:tc>
+          <w:tcPr>
+            <w:tcW w:type="dxa" w:w="3376"/>
+            <w:tcBorders>
+              <w:top w:val="single" w:color="BFBFBF" w:sz="4"/>
+              <w:left w:val="single" w:color="BFBFBF" w:sz="4"/>
+              <w:bottom w:val="single" w:color="BFBFBF" w:sz="4"/>
+              <w:right w:val="single" w:color="BFBFBF" w:sz="4"/>
+            </w:tcBorders>
+            <w:shd w:fill="FFFFFF" w:color="auto" w:val="clear"/>
+            <w:tcMar>
+              <w:top w:type="dxa" w:w="60"/>
+              <w:left w:type="dxa" w:w="100"/>
+              <w:bottom w:type="dxa" w:w="60"/>
+              <w:right w:type="dxa" w:w="100"/>
+            </w:tcMar>
+          </w:tcPr>
+          <w:p>
+            <w:r>
+              <w:rPr>
+                <w:sz w:val="20"/>
+                <w:szCs w:val="20"/>
+              </w:rPr>
+              <w:t xml:space="preserve">Certo: recusou, indicou dermatologista e ofereceu serviços sem química</w:t>
+            </w:r>
+          </w:p>
+        </w:tc>
+        <w:tc>
+          <w:tcPr>
+            <w:tcW w:type="dxa" w:w="850"/>
+            <w:tcBorders>
+              <w:top w:val="single" w:color="BFBFBF" w:sz="4"/>
+              <w:left w:val="single" w:color="BFBFBF" w:sz="4"/>
+              <w:bottom w:val="single" w:color="BFBFBF" w:sz="4"/>
+              <w:right w:val="single" w:color="BFBFBF" w:sz="4"/>
+            </w:tcBorders>
+            <w:shd w:fill="FFFFFF" w:color="auto" w:val="clear"/>
+            <w:tcMar>
+              <w:top w:type="dxa" w:w="60"/>
+              <w:left w:type="dxa" w:w="100"/>
+              <w:bottom w:type="dxa" w:w="60"/>
+              <w:right w:type="dxa" w:w="100"/>
+            </w:tcMar>
+          </w:tcPr>
+          <w:p>
+            <w:r>
+              <w:rPr>
+                <w:sz w:val="20"/>
+                <w:szCs w:val="20"/>
+              </w:rPr>
+              <w:t xml:space="preserve">2,1</w:t>
+            </w:r>
+          </w:p>
+        </w:tc>
+      </w:tr>
+      <w:tr>
+        <w:tc>
+          <w:tcPr>
+            <w:tcW w:type="dxa" w:w="450"/>
+            <w:tcBorders>
+              <w:top w:val="single" w:color="BFBFBF" w:sz="4"/>
+              <w:left w:val="single" w:color="BFBFBF" w:sz="4"/>
+              <w:bottom w:val="single" w:color="BFBFBF" w:sz="4"/>
+              <w:right w:val="single" w:color="BFBFBF" w:sz="4"/>
+            </w:tcBorders>
+            <w:shd w:fill="F6F0F8" w:color="auto" w:val="clear"/>
+            <w:tcMar>
+              <w:top w:type="dxa" w:w="60"/>
+              <w:left w:type="dxa" w:w="100"/>
+              <w:bottom w:type="dxa" w:w="60"/>
+              <w:right w:type="dxa" w:w="100"/>
+            </w:tcMar>
+          </w:tcPr>
+          <w:p>
+            <w:r>
+              <w:rPr>
+                <w:sz w:val="20"/>
+                <w:szCs w:val="20"/>
+              </w:rPr>
+              <w:t xml:space="preserve">8</w:t>
+            </w:r>
+          </w:p>
+        </w:tc>
+        <w:tc>
+          <w:tcPr>
+            <w:tcW w:type="dxa" w:w="2300"/>
+            <w:tcBorders>
+              <w:top w:val="single" w:color="BFBFBF" w:sz="4"/>
+              <w:left w:val="single" w:color="BFBFBF" w:sz="4"/>
+              <w:bottom w:val="single" w:color="BFBFBF" w:sz="4"/>
+              <w:right w:val="single" w:color="BFBFBF" w:sz="4"/>
+            </w:tcBorders>
+            <w:shd w:fill="F6F0F8" w:color="auto" w:val="clear"/>
+            <w:tcMar>
+              <w:top w:type="dxa" w:w="60"/>
+              <w:left w:type="dxa" w:w="100"/>
+              <w:bottom w:type="dxa" w:w="60"/>
+              <w:right w:type="dxa" w:w="100"/>
+            </w:tcMar>
+          </w:tcPr>
+          <w:p>
+            <w:r>
+              <w:rPr>
+                <w:sz w:val="20"/>
+                <w:szCs w:val="20"/>
+              </w:rPr>
+              <w:t xml:space="preserve">"Me ajuda com o dever de matemática"</w:t>
+            </w:r>
+          </w:p>
+        </w:tc>
+        <w:tc>
+          <w:tcPr>
+            <w:tcW w:type="dxa" w:w="2050"/>
+            <w:tcBorders>
+              <w:top w:val="single" w:color="BFBFBF" w:sz="4"/>
+              <w:left w:val="single" w:color="BFBFBF" w:sz="4"/>
+              <w:bottom w:val="single" w:color="BFBFBF" w:sz="4"/>
+              <w:right w:val="single" w:color="BFBFBF" w:sz="4"/>
+            </w:tcBorders>
+            <w:shd w:fill="F6F0F8" w:color="auto" w:val="clear"/>
+            <w:tcMar>
+              <w:top w:type="dxa" w:w="60"/>
+              <w:left w:type="dxa" w:w="100"/>
+              <w:bottom w:type="dxa" w:w="60"/>
+              <w:right w:type="dxa" w:w="100"/>
+            </w:tcMar>
+          </w:tcPr>
+          <w:p>
+            <w:r>
+              <w:rPr>
+                <w:sz w:val="20"/>
+                <w:szCs w:val="20"/>
+              </w:rPr>
+              <w:t xml:space="preserve">Recusa, fora do escopo</w:t>
+            </w:r>
+          </w:p>
+        </w:tc>
+        <w:tc>
+          <w:tcPr>
+            <w:tcW w:type="dxa" w:w="3376"/>
+            <w:tcBorders>
+              <w:top w:val="single" w:color="BFBFBF" w:sz="4"/>
+              <w:left w:val="single" w:color="BFBFBF" w:sz="4"/>
+              <w:bottom w:val="single" w:color="BFBFBF" w:sz="4"/>
+              <w:right w:val="single" w:color="BFBFBF" w:sz="4"/>
+            </w:tcBorders>
+            <w:shd w:fill="F6F0F8" w:color="auto" w:val="clear"/>
+            <w:tcMar>
+              <w:top w:type="dxa" w:w="60"/>
+              <w:left w:type="dxa" w:w="100"/>
+              <w:bottom w:type="dxa" w:w="60"/>
+              <w:right w:type="dxa" w:w="100"/>
+            </w:tcMar>
+          </w:tcPr>
+          <w:p>
+            <w:r>
+              <w:rPr>
+                <w:sz w:val="20"/>
+                <w:szCs w:val="20"/>
+              </w:rPr>
+              <w:t xml:space="preserve">Certo: só ajuda com o salão</w:t>
+            </w:r>
+          </w:p>
+        </w:tc>
+        <w:tc>
+          <w:tcPr>
+            <w:tcW w:type="dxa" w:w="850"/>
+            <w:tcBorders>
+              <w:top w:val="single" w:color="BFBFBF" w:sz="4"/>
+              <w:left w:val="single" w:color="BFBFBF" w:sz="4"/>
+              <w:bottom w:val="single" w:color="BFBFBF" w:sz="4"/>
+              <w:right w:val="single" w:color="BFBFBF" w:sz="4"/>
+            </w:tcBorders>
+            <w:shd w:fill="F6F0F8" w:color="auto" w:val="clear"/>
+            <w:tcMar>
+              <w:top w:type="dxa" w:w="60"/>
+              <w:left w:type="dxa" w:w="100"/>
+              <w:bottom w:type="dxa" w:w="60"/>
+              <w:right w:type="dxa" w:w="100"/>
+            </w:tcMar>
+          </w:tcPr>
+          <w:p>
+            <w:r>
+              <w:rPr>
+                <w:sz w:val="20"/>
+                <w:szCs w:val="20"/>
+              </w:rPr>
+              <w:t xml:space="preserve">1,8</w:t>
+            </w:r>
+          </w:p>
+        </w:tc>
+      </w:tr>
+      <w:tr>
+        <w:tc>
+          <w:tcPr>
+            <w:tcW w:type="dxa" w:w="450"/>
+            <w:tcBorders>
+              <w:top w:val="single" w:color="BFBFBF" w:sz="4"/>
+              <w:left w:val="single" w:color="BFBFBF" w:sz="4"/>
+              <w:bottom w:val="single" w:color="BFBFBF" w:sz="4"/>
+              <w:right w:val="single" w:color="BFBFBF" w:sz="4"/>
+            </w:tcBorders>
+            <w:shd w:fill="FFFFFF" w:color="auto" w:val="clear"/>
+            <w:tcMar>
+              <w:top w:type="dxa" w:w="60"/>
+              <w:left w:type="dxa" w:w="100"/>
+              <w:bottom w:type="dxa" w:w="60"/>
+              <w:right w:type="dxa" w:w="100"/>
+            </w:tcMar>
+          </w:tcPr>
+          <w:p>
+            <w:r>
+              <w:rPr>
+                <w:sz w:val="20"/>
+                <w:szCs w:val="20"/>
+              </w:rPr>
+              <w:t xml:space="preserve">9</w:t>
+            </w:r>
+          </w:p>
+        </w:tc>
+        <w:tc>
+          <w:tcPr>
+            <w:tcW w:type="dxa" w:w="2300"/>
+            <w:tcBorders>
+              <w:top w:val="single" w:color="BFBFBF" w:sz="4"/>
+              <w:left w:val="single" w:color="BFBFBF" w:sz="4"/>
+              <w:bottom w:val="single" w:color="BFBFBF" w:sz="4"/>
+              <w:right w:val="single" w:color="BFBFBF" w:sz="4"/>
+            </w:tcBorders>
+            <w:shd w:fill="FFFFFF" w:color="auto" w:val="clear"/>
+            <w:tcMar>
+              <w:top w:type="dxa" w:w="60"/>
+              <w:left w:type="dxa" w:w="100"/>
+              <w:bottom w:type="dxa" w:w="60"/>
+              <w:right w:type="dxa" w:w="100"/>
+            </w:tcMar>
+          </w:tcPr>
+          <w:p>
+            <w:r>
+              <w:rPr>
+                <w:sz w:val="20"/>
+                <w:szCs w:val="20"/>
+              </w:rPr>
+              <w:t xml:space="preserve">Mechas sábado às 15h</w:t>
+            </w:r>
+          </w:p>
+        </w:tc>
+        <w:tc>
+          <w:tcPr>
+            <w:tcW w:type="dxa" w:w="2050"/>
+            <w:tcBorders>
+              <w:top w:val="single" w:color="BFBFBF" w:sz="4"/>
+              <w:left w:val="single" w:color="BFBFBF" w:sz="4"/>
+              <w:bottom w:val="single" w:color="BFBFBF" w:sz="4"/>
+              <w:right w:val="single" w:color="BFBFBF" w:sz="4"/>
+            </w:tcBorders>
+            <w:shd w:fill="FFFFFF" w:color="auto" w:val="clear"/>
+            <w:tcMar>
+              <w:top w:type="dxa" w:w="60"/>
+              <w:left w:type="dxa" w:w="100"/>
+              <w:bottom w:type="dxa" w:w="60"/>
+              <w:right w:type="dxa" w:w="100"/>
+            </w:tcMar>
+          </w:tcPr>
+          <w:p>
+            <w:r>
+              <w:rPr>
+                <w:sz w:val="20"/>
+                <w:szCs w:val="20"/>
+              </w:rPr>
+              <w:t xml:space="preserve">Não cabe (fecha 17h), oferece outro</w:t>
+            </w:r>
+          </w:p>
+        </w:tc>
+        <w:tc>
+          <w:tcPr>
+            <w:tcW w:type="dxa" w:w="3376"/>
+            <w:tcBorders>
+              <w:top w:val="single" w:color="BFBFBF" w:sz="4"/>
+              <w:left w:val="single" w:color="BFBFBF" w:sz="4"/>
+              <w:bottom w:val="single" w:color="BFBFBF" w:sz="4"/>
+              <w:right w:val="single" w:color="BFBFBF" w:sz="4"/>
+            </w:tcBorders>
+            <w:shd w:fill="FFFFFF" w:color="auto" w:val="clear"/>
+            <w:tcMar>
+              <w:top w:type="dxa" w:w="60"/>
+              <w:left w:type="dxa" w:w="100"/>
+              <w:bottom w:type="dxa" w:w="60"/>
+              <w:right w:type="dxa" w:w="100"/>
+            </w:tcMar>
+          </w:tcPr>
+          <w:p>
+            <w:r>
+              <w:rPr>
+                <w:sz w:val="20"/>
+                <w:szCs w:val="20"/>
+              </w:rPr>
+              <w:t xml:space="preserve">Certo: agendou das 14h às 17h. Falha: uma alternativa se sobrepunha</w:t>
+            </w:r>
+          </w:p>
+        </w:tc>
+        <w:tc>
+          <w:tcPr>
+            <w:tcW w:type="dxa" w:w="850"/>
+            <w:tcBorders>
+              <w:top w:val="single" w:color="BFBFBF" w:sz="4"/>
+              <w:left w:val="single" w:color="BFBFBF" w:sz="4"/>
+              <w:bottom w:val="single" w:color="BFBFBF" w:sz="4"/>
+              <w:right w:val="single" w:color="BFBFBF" w:sz="4"/>
+            </w:tcBorders>
+            <w:shd w:fill="FFFFFF" w:color="auto" w:val="clear"/>
+            <w:tcMar>
+              <w:top w:type="dxa" w:w="60"/>
+              <w:left w:type="dxa" w:w="100"/>
+              <w:bottom w:type="dxa" w:w="60"/>
+              <w:right w:type="dxa" w:w="100"/>
+            </w:tcMar>
+          </w:tcPr>
+          <w:p>
+            <w:r>
+              <w:rPr>
+                <w:sz w:val="20"/>
+                <w:szCs w:val="20"/>
+              </w:rPr>
+              <w:t xml:space="preserve">4,7</w:t>
+            </w:r>
+          </w:p>
+        </w:tc>
+      </w:tr>
+      <w:tr>
+        <w:tc>
+          <w:tcPr>
+            <w:tcW w:type="dxa" w:w="450"/>
+            <w:tcBorders>
+              <w:top w:val="single" w:color="BFBFBF" w:sz="4"/>
+              <w:left w:val="single" w:color="BFBFBF" w:sz="4"/>
+              <w:bottom w:val="single" w:color="BFBFBF" w:sz="4"/>
+              <w:right w:val="single" w:color="BFBFBF" w:sz="4"/>
+            </w:tcBorders>
+            <w:shd w:fill="F6F0F8" w:color="auto" w:val="clear"/>
+            <w:tcMar>
+              <w:top w:type="dxa" w:w="60"/>
+              <w:left w:type="dxa" w:w="100"/>
+              <w:bottom w:type="dxa" w:w="60"/>
+              <w:right w:type="dxa" w:w="100"/>
+            </w:tcMar>
+          </w:tcPr>
+          <w:p>
+            <w:r>
+              <w:rPr>
+                <w:sz w:val="20"/>
+                <w:szCs w:val="20"/>
+              </w:rPr>
+              <w:t xml:space="preserve">10</w:t>
+            </w:r>
+          </w:p>
+        </w:tc>
+        <w:tc>
+          <w:tcPr>
+            <w:tcW w:type="dxa" w:w="2300"/>
+            <w:tcBorders>
+              <w:top w:val="single" w:color="BFBFBF" w:sz="4"/>
+              <w:left w:val="single" w:color="BFBFBF" w:sz="4"/>
+              <w:bottom w:val="single" w:color="BFBFBF" w:sz="4"/>
+              <w:right w:val="single" w:color="BFBFBF" w:sz="4"/>
+            </w:tcBorders>
+            <w:shd w:fill="F6F0F8" w:color="auto" w:val="clear"/>
+            <w:tcMar>
+              <w:top w:type="dxa" w:w="60"/>
+              <w:left w:type="dxa" w:w="100"/>
+              <w:bottom w:type="dxa" w:w="60"/>
+              <w:right w:type="dxa" w:w="100"/>
+            </w:tcMar>
+          </w:tcPr>
+          <w:p>
+            <w:r>
+              <w:rPr>
+                <w:sz w:val="20"/>
+                <w:szCs w:val="20"/>
+              </w:rPr>
+              <w:t xml:space="preserve">Confirma o agendamento</w:t>
+            </w:r>
+          </w:p>
+        </w:tc>
+        <w:tc>
+          <w:tcPr>
+            <w:tcW w:type="dxa" w:w="2050"/>
+            <w:tcBorders>
+              <w:top w:val="single" w:color="BFBFBF" w:sz="4"/>
+              <w:left w:val="single" w:color="BFBFBF" w:sz="4"/>
+              <w:bottom w:val="single" w:color="BFBFBF" w:sz="4"/>
+              <w:right w:val="single" w:color="BFBFBF" w:sz="4"/>
+            </w:tcBorders>
+            <w:shd w:fill="F6F0F8" w:color="auto" w:val="clear"/>
+            <w:tcMar>
+              <w:top w:type="dxa" w:w="60"/>
+              <w:left w:type="dxa" w:w="100"/>
+              <w:bottom w:type="dxa" w:w="60"/>
+              <w:right w:type="dxa" w:w="100"/>
+            </w:tcMar>
+          </w:tcPr>
+          <w:p>
+            <w:r>
+              <w:rPr>
+                <w:sz w:val="20"/>
+                <w:szCs w:val="20"/>
+              </w:rPr>
+              <w:t xml:space="preserve">Evento com duração certa</w:t>
+            </w:r>
+          </w:p>
+        </w:tc>
+        <w:tc>
+          <w:tcPr>
+            <w:tcW w:type="dxa" w:w="3376"/>
+            <w:tcBorders>
+              <w:top w:val="single" w:color="BFBFBF" w:sz="4"/>
+              <w:left w:val="single" w:color="BFBFBF" w:sz="4"/>
+              <w:bottom w:val="single" w:color="BFBFBF" w:sz="4"/>
+              <w:right w:val="single" w:color="BFBFBF" w:sz="4"/>
+            </w:tcBorders>
+            <w:shd w:fill="F6F0F8" w:color="auto" w:val="clear"/>
+            <w:tcMar>
+              <w:top w:type="dxa" w:w="60"/>
+              <w:left w:type="dxa" w:w="100"/>
+              <w:bottom w:type="dxa" w:w="60"/>
+              <w:right w:type="dxa" w:w="100"/>
+            </w:tcMar>
+          </w:tcPr>
+          <w:p>
+            <w:r>
+              <w:rPr>
+                <w:sz w:val="20"/>
+                <w:szCs w:val="20"/>
+              </w:rPr>
+              <w:t xml:space="preserve">Certo: criou o evento na agenda com o cliente como convidado</w:t>
+            </w:r>
+          </w:p>
+        </w:tc>
+        <w:tc>
+          <w:tcPr>
+            <w:tcW w:type="dxa" w:w="850"/>
+            <w:tcBorders>
+              <w:top w:val="single" w:color="BFBFBF" w:sz="4"/>
+              <w:left w:val="single" w:color="BFBFBF" w:sz="4"/>
+              <w:bottom w:val="single" w:color="BFBFBF" w:sz="4"/>
+              <w:right w:val="single" w:color="BFBFBF" w:sz="4"/>
+            </w:tcBorders>
+            <w:shd w:fill="F6F0F8" w:color="auto" w:val="clear"/>
+            <w:tcMar>
+              <w:top w:type="dxa" w:w="60"/>
+              <w:left w:type="dxa" w:w="100"/>
+              <w:bottom w:type="dxa" w:w="60"/>
+              <w:right w:type="dxa" w:w="100"/>
+            </w:tcMar>
+          </w:tcPr>
+          <w:p>
+            <w:r>
+              <w:rPr>
+                <w:sz w:val="20"/>
+                <w:szCs w:val="20"/>
+              </w:rPr>
+              <w:t xml:space="preserve">3,9</w:t>
+            </w:r>
+          </w:p>
+        </w:tc>
+      </w:tr>
+    </w:tbl>
+    <w:p>
+      <w:pPr>
+        <w:spacing w:after="120"/>
+      </w:pPr>
+    </w:p>
+    <w:p>
+      <w:pPr>
+        <w:spacing w:after="140" w:line="330"/>
+        <w:jc w:val="both"/>
+      </w:pPr>
+      <w:r>
+        <w:rPr>
+          <w:b/>
+          <w:bCs/>
+        </w:rPr>
+        <w:t xml:space="preserve">Resultado:</w:t>
+      </w:r>
+      <w:r>
+        <w:t xml:space="preserve"> 10 de 10 (100%) no comportamento esperado de cada teste. No teste 9, uma das três alternativas oferecidas tinha sobreposição de horário, o que levou ao segundo ajuste do prompt (seção 6.5).</w:t>
+      </w:r>
+    </w:p>
+    <w:p>
+      <w:pPr>
+        <w:spacing w:after="140" w:line="330"/>
+        <w:jc w:val="both"/>
+      </w:pPr>
+      <w:r>
+        <w:rPr>
+          <w:b/>
+          <w:bCs/>
+        </w:rPr>
+        <w:t xml:space="preserve">Tempo de execução:</w:t>
+      </w:r>
+      <w:r>
+        <w:t xml:space="preserve"> média de 3,1 segundos por resposta, variando de 1,1 s (pergunta simples, sem ferramenta) a 8,0 s (consulta à agenda e duas decisões na mesma resposta). Respostas que consultam ou gravam na agenda levam em média 5,2 s; as demais, cerca de 1,7 s.</w:t>
+      </w:r>
+    </w:p>
+    <w:p>
+      <w:pPr>
+        <w:spacing w:after="80"/>
+        <w:jc w:val="both"/>
+      </w:pPr>
+      <w:r>
+        <w:rPr>
+          <w:b/>
+          <w:bCs/>
+        </w:rPr>
+        <w:t xml:space="preserve">Segurança dos dados:</w:t>
+      </w:r>
+    </w:p>
+    <w:p>
+      <w:pPr>
+        <w:pStyle w:val="ListParagraph"/>
+        <w:numPr>
+          <w:ilvl w:val="0"/>
+          <w:numId w:val="4"/>
+        </w:numPr>
+        <w:spacing w:after="80" w:line="310"/>
+      </w:pPr>
+      <w:r>
+        <w:t xml:space="preserve">Chaves de API guardadas no gerenciador de credenciais do n8n, fora do código.</w:t>
+      </w:r>
+    </w:p>
+    <w:p>
+      <w:pPr>
+        <w:pStyle w:val="ListParagraph"/>
+        <w:numPr>
+          <w:ilvl w:val="0"/>
+          <w:numId w:val="4"/>
+        </w:numPr>
+        <w:spacing w:after="80" w:line="310"/>
+      </w:pPr>
+      <w:r>
+        <w:t xml:space="preserve">Ferramentas com poder limitado: o agente só consegue ler e criar eventos na agenda do negócio; não consegue apagar nem acessar outros dados.</w:t>
+      </w:r>
+    </w:p>
+    <w:p>
+      <w:pPr>
+        <w:pStyle w:val="ListParagraph"/>
+        <w:numPr>
+          <w:ilvl w:val="0"/>
+          <w:numId w:val="4"/>
+        </w:numPr>
+        <w:spacing w:after="80" w:line="310"/>
+      </w:pPr>
+      <w:r>
+        <w:t xml:space="preserve">Privacidade: o agente não revela agendamentos de outros clientes.</w:t>
+      </w:r>
+    </w:p>
+    <w:p>
+      <w:pPr>
+        <w:pStyle w:val="ListParagraph"/>
+        <w:numPr>
+          <w:ilvl w:val="0"/>
+          <w:numId w:val="4"/>
+        </w:numPr>
+        <w:spacing w:after="80" w:line="310"/>
+      </w:pPr>
+      <w:r>
+        <w:t xml:space="preserve">O agente só pede nome e e-mail, o mínimo para agendar (princípio da necessidade da LGPD).</w:t>
+      </w:r>
+    </w:p>
+    <w:p>
+      <w:pPr>
+        <w:pStyle w:val="ListParagraph"/>
+        <w:numPr>
+          <w:ilvl w:val="0"/>
+          <w:numId w:val="4"/>
+        </w:numPr>
+        <w:spacing w:after="80" w:line="310"/>
+      </w:pPr>
+      <w:r>
+        <w:t xml:space="preserve">Testes feitos apenas com dados fictícios e um e-mail criado para testes.</w:t>
+      </w:r>
+    </w:p>
+    <w:p>
+      <w:pPr>
+        <w:pStyle w:val="Heading2"/>
+      </w:pPr>
+      <w:r>
+        <w:t xml:space="preserve">Exemplo de conversa</w:t>
+      </w:r>
+    </w:p>
+    <w:p>
+      <w:pPr>
         <w:spacing w:after="60" w:before="120"/>
         <w:jc w:val="center"/>
       </w:pPr>
       <w:r>
         <w:drawing>
           <wp:inline distT="0" distB="0" distL="0" distR="0">
-            <wp:extent cx="4095750" cy="4972050"/>
+            <wp:extent cx="4095750" cy="4057650"/>
             <wp:effectExtent t="0" r="0" b="0" l="0"/>
             <wp:docPr id="5" name=""/>
             <wp:cNvGraphicFramePr>
@@ -5781,6 +5988,52 @@
                   <pic:spPr bwMode="auto">
                     <a:xfrm>
                       <a:off x="0" y="0"/>
+                      <a:ext cx="4095750" cy="4057650"/>
+                    </a:xfrm>
+                    <a:prstGeom prst="rect">
+                      <a:avLst/>
+                    </a:prstGeom>
+                  </pic:spPr>
+                </pic:pic>
+              </a:graphicData>
+            </a:graphic>
+          </wp:inline>
+        </w:drawing>
+      </w:r>
+    </w:p>
+    <w:p>
+      <w:pPr>
+        <w:spacing w:after="60" w:before="120"/>
+        <w:jc w:val="center"/>
+      </w:pPr>
+      <w:r>
+        <w:drawing>
+          <wp:inline distT="0" distB="0" distL="0" distR="0">
+            <wp:extent cx="4095750" cy="4972050"/>
+            <wp:effectExtent t="0" r="0" b="0" l="0"/>
+            <wp:docPr id="6" name=""/>
+            <wp:cNvGraphicFramePr>
+              <a:graphicFrameLocks xmlns:a="http://schemas.openxmlformats.org/drawingml/2006/main" noChangeAspect="1"/>
+            </wp:cNvGraphicFramePr>
+            <a:graphic xmlns:a="http://schemas.openxmlformats.org/drawingml/2006/main">
+              <a:graphicData uri="http://schemas.openxmlformats.org/drawingml/2006/picture">
+                <pic:pic xmlns:pic="http://schemas.openxmlformats.org/drawingml/2006/picture">
+                  <pic:nvPicPr>
+                    <pic:cNvPr id="0" name="" descr=""/>
+                    <pic:cNvPicPr>
+                      <a:picLocks noChangeAspect="1" noChangeArrowheads="1"/>
+                    </pic:cNvPicPr>
+                  </pic:nvPicPr>
+                  <pic:blipFill>
+                    <a:blip r:embed="rId13" cstate="none"/>
+                    <a:srcRect/>
+                    <a:stretch>
+                      <a:fillRect/>
+                    </a:stretch>
+                  </pic:blipFill>
+                  <pic:spPr bwMode="auto">
+                    <a:xfrm>
+                      <a:off x="0" y="0"/>
                       <a:ext cx="4095750" cy="4972050"/>
                     </a:xfrm>
                     <a:prstGeom prst="rect">
@@ -5807,7 +6060,7 @@
           <w:sz w:val="20"/>
           <w:szCs w:val="20"/>
         </w:rPr>
-        <w:t xml:space="preserve">Figura 4 – Conversa real do teste 6: triagem, regra do teste de alergia, conferência da agenda e confirmação</w:t>
+        <w:t xml:space="preserve">Figura 5 – Conversa real do teste 6: triagem, regra do teste de alergia, conferência da agenda e confirmação</w:t>
       </w:r>
     </w:p>
     <w:p>
@@ -5824,7 +6077,7 @@
         <w:jc w:val="both"/>
       </w:pPr>
       <w:r>
-        <w:t xml:space="preserve">O agente cumpriu o objetivo: atendeu clientes por chat, entendeu pedidos escritos com as palavras do próprio cliente, indicou serviço, profissional, duração e preço, aplicou a regra de segurança da química e criou os atendimentos no Google Agenda com convite por e-mail. Nos 10 testes, acertou o comportamento esperado em todos, com tempo médio de 3,1 segundos por resposta.</w:t>
+        <w:t xml:space="preserve">O agente cumpriu o objetivo: atendeu clientes pelo chat e por um número de WhatsApp real, entendeu pedidos escritos com as palavras do próprio cliente, indicou serviço, profissional, duração e preço, aplicou a regra de segurança da química e criou os atendimentos no Google Agenda com convite por e-mail. Nos 10 testes, acertou o comportamento esperado em todos, com tempo médio de 3,1 segundos por resposta.</w:t>
       </w:r>
     </w:p>
     <w:p>
@@ -5849,7 +6102,7 @@
         <w:t xml:space="preserve">Próximos passos:</w:t>
       </w:r>
       <w:r>
-        <w:t xml:space="preserve"> conectar um número de WhatsApp real pela Evolution API, enviar lembrete no dia anterior, permitir cancelamento e remarcação e testar a solução com um salão de verdade. Como o fluxo é genérico, a mesma base pode atender barbearias, estúdios de unhas e clínicas de estética trocando apenas a configuração.</w:t>
+        <w:t xml:space="preserve"> levar a Evolution API e o n8n para um servidor com endereço fixo (ou usar a API oficial do WhatsApp Business), enviar lembrete no dia anterior, permitir cancelamento e remarcação e testar a solução com um salão de verdade. Como o fluxo é genérico, a mesma base pode atender barbearias, estúdios de unhas e clínicas de estética trocando apenas a configuração.</w:t>
       </w:r>
     </w:p>
     <w:p>
@@ -5885,6 +6138,15 @@
       </w:pPr>
       <w:r>
         <w:t xml:space="preserve">DEEPSEEK. API Docs. Disponível em: https://api-docs.deepseek.com. Acesso em: out. 2026.</w:t>
+      </w:r>
+    </w:p>
+    <w:p>
+      <w:pPr>
+        <w:spacing w:after="140" w:line="330"/>
+        <w:jc w:val="left"/>
+      </w:pPr>
+      <w:r>
+        <w:t xml:space="preserve">EVOLUTION API. Documentação. Disponível em: https://doc.evolution-api.com. Acesso em: out. 2026.</w:t>
       </w:r>
     </w:p>
     <w:p>
@@ -6665,6 +6927,18 @@
       </w:pPr>
     </w:lvl>
   </w:abstractNum>
+  <w:abstractNum w:abstractNumId="6" w15:restartNumberingAfterBreak="0">
+    <w:multiLevelType w:val="hybridMultilevel"/>
+    <w:lvl w:ilvl="0" w:tentative="1">
+      <w:start w:val="1"/>
+      <w:numFmt w:val="decimal"/>
+      <w:lvlText w:val="%1."/>
+      <w:lvlJc w:val="left"/>
+      <w:pPr>
+        <w:ind w:left="720" w:hanging="360"/>
+      </w:pPr>
+    </w:lvl>
+  </w:abstractNum>
   <w:num w:numId="1">
     <w:abstractNumId w:val="1"/>
     <w:lvlOverride w:ilvl="0">
@@ -6691,6 +6965,12 @@
   </w:num>
   <w:num w:numId="5">
     <w:abstractNumId w:val="5"/>
+    <w:lvlOverride w:ilvl="0">
+      <w:startOverride w:val="1"/>
+    </w:lvlOverride>
+  </w:num>
+  <w:num w:numId="6">
+    <w:abstractNumId w:val="6"/>
     <w:lvlOverride w:ilvl="0">
       <w:startOverride w:val="1"/>
     </w:lvlOverride>

</xml_diff>